<commit_message>
2.开题报告\实稿\CN（翻译版）_Appendix-1-Form for the registration of the subject.docx 2.开题报告\模版\~$（翻译版）_Appendix-1-Form for the registration of the subject .docx
Signed-off-by: 徐振宇 <xuzhenyu3333@gmail.com>
</commit_message>
<xml_diff>
--- a/2.开题报告/实稿/CN（翻译版）_Appendix-1-Form for the registration of the subject.docx
+++ b/2.开题报告/实稿/CN（翻译版）_Appendix-1-Form for the registration of the subject.docx
@@ -1589,8 +1589,10 @@
         <w:spacing w:line="276" w:lineRule="auto"/>
         <w:ind w:left="0" w:hanging="2"/>
         <w:rPr>
-          <w:rFonts w:eastAsiaTheme="minorEastAsia" w:hint="eastAsia"/>
-          <w:color w:val="262626"/>
+          <w:rFonts w:eastAsiaTheme="minorEastAsia"/>
+          <w:b/>
+          <w:bCs/>
+          <w:color w:val="215868" w:themeColor="accent5" w:themeShade="80"/>
           <w:lang w:val="en-GB" w:eastAsia="zh-CN"/>
         </w:rPr>
       </w:pPr>
@@ -1632,7 +1634,319 @@
           <w:color w:val="215868" w:themeColor="accent5" w:themeShade="80"/>
           <w:lang w:val="en-GB" w:eastAsia="zh-CN"/>
         </w:rPr>
-        <w:t>，导致护理文书缺陷频发，</w:t>
+        <w:t>，导致</w:t>
+      </w:r>
+      <w:r>
+        <w:rPr>
+          <w:rFonts w:eastAsiaTheme="minorEastAsia" w:hint="eastAsia"/>
+          <w:b/>
+          <w:bCs/>
+          <w:color w:val="215868" w:themeColor="accent5" w:themeShade="80"/>
+          <w:lang w:val="en-GB" w:eastAsia="zh-CN"/>
+        </w:rPr>
+        <w:t>大量潜在</w:t>
+      </w:r>
+      <w:r>
+        <w:rPr>
+          <w:rFonts w:eastAsiaTheme="minorEastAsia" w:hint="eastAsia"/>
+          <w:b/>
+          <w:bCs/>
+          <w:color w:val="215868" w:themeColor="accent5" w:themeShade="80"/>
+          <w:lang w:val="en-GB" w:eastAsia="zh-CN"/>
+        </w:rPr>
+        <w:t>护理文书缺陷</w:t>
+      </w:r>
+      <w:r>
+        <w:rPr>
+          <w:rFonts w:eastAsiaTheme="minorEastAsia" w:hint="eastAsia"/>
+          <w:b/>
+          <w:bCs/>
+          <w:color w:val="215868" w:themeColor="accent5" w:themeShade="80"/>
+          <w:lang w:val="en-GB" w:eastAsia="zh-CN"/>
+        </w:rPr>
+        <w:t>未被及时发现</w:t>
+      </w:r>
+      <w:r>
+        <w:rPr>
+          <w:rFonts w:eastAsiaTheme="minorEastAsia" w:hint="eastAsia"/>
+          <w:b/>
+          <w:bCs/>
+          <w:color w:val="215868" w:themeColor="accent5" w:themeShade="80"/>
+          <w:lang w:val="en-GB" w:eastAsia="zh-CN"/>
+        </w:rPr>
+        <w:t>。</w:t>
+      </w:r>
+      <w:r>
+        <w:rPr>
+          <w:rFonts w:eastAsiaTheme="minorEastAsia" w:hint="eastAsia"/>
+          <w:b/>
+          <w:bCs/>
+          <w:color w:val="215868" w:themeColor="accent5" w:themeShade="80"/>
+          <w:lang w:val="en-GB" w:eastAsia="zh-CN"/>
+        </w:rPr>
+        <w:t>一项基于</w:t>
+      </w:r>
+      <w:r>
+        <w:rPr>
+          <w:rFonts w:eastAsiaTheme="minorEastAsia" w:hint="eastAsia"/>
+          <w:b/>
+          <w:bCs/>
+          <w:color w:val="215868" w:themeColor="accent5" w:themeShade="80"/>
+          <w:lang w:val="en-GB" w:eastAsia="zh-CN"/>
+        </w:rPr>
+        <w:t>首都儿科研究所附属儿童医院</w:t>
+      </w:r>
+      <w:r>
+        <w:rPr>
+          <w:rFonts w:eastAsiaTheme="minorEastAsia" w:hint="eastAsia"/>
+          <w:b/>
+          <w:bCs/>
+          <w:color w:val="215868" w:themeColor="accent5" w:themeShade="80"/>
+          <w:lang w:val="en-GB" w:eastAsia="zh-CN"/>
+        </w:rPr>
+        <w:t>，</w:t>
+      </w:r>
+      <w:r>
+        <w:rPr>
+          <w:rFonts w:eastAsiaTheme="minorEastAsia" w:hint="eastAsia"/>
+          <w:b/>
+          <w:bCs/>
+          <w:color w:val="215868" w:themeColor="accent5" w:themeShade="80"/>
+          <w:lang w:val="en-GB" w:eastAsia="zh-CN"/>
+        </w:rPr>
+        <w:t>涵盖了</w:t>
+      </w:r>
+      <w:r>
+        <w:rPr>
+          <w:rFonts w:eastAsiaTheme="minorEastAsia" w:hint="eastAsia"/>
+          <w:b/>
+          <w:bCs/>
+          <w:color w:val="215868" w:themeColor="accent5" w:themeShade="80"/>
+          <w:lang w:val="en-GB" w:eastAsia="zh-CN"/>
+        </w:rPr>
+        <w:t>500</w:t>
+      </w:r>
+      <w:r>
+        <w:rPr>
+          <w:rFonts w:eastAsiaTheme="minorEastAsia" w:hint="eastAsia"/>
+          <w:b/>
+          <w:bCs/>
+          <w:color w:val="215868" w:themeColor="accent5" w:themeShade="80"/>
+          <w:lang w:val="en-GB" w:eastAsia="zh-CN"/>
+        </w:rPr>
+        <w:t>份护理文书的研究显示，</w:t>
+      </w:r>
+      <w:r>
+        <w:rPr>
+          <w:rFonts w:eastAsiaTheme="minorEastAsia" w:hint="eastAsia"/>
+          <w:b/>
+          <w:bCs/>
+          <w:color w:val="215868" w:themeColor="accent5" w:themeShade="80"/>
+          <w:lang w:eastAsia="zh-CN"/>
+        </w:rPr>
+        <w:t>常见的缺陷类型以及发生率分别是为：</w:t>
+      </w:r>
+      <w:r>
+        <w:rPr>
+          <w:rFonts w:eastAsiaTheme="minorEastAsia"/>
+          <w:b/>
+          <w:bCs/>
+          <w:color w:val="215868" w:themeColor="accent5" w:themeShade="80"/>
+          <w:lang w:eastAsia="zh-CN"/>
+        </w:rPr>
+        <w:t>风险评估不合格</w:t>
+      </w:r>
+      <w:r>
+        <w:rPr>
+          <w:rFonts w:eastAsiaTheme="minorEastAsia"/>
+          <w:b/>
+          <w:bCs/>
+          <w:color w:val="215868" w:themeColor="accent5" w:themeShade="80"/>
+          <w:lang w:eastAsia="zh-CN"/>
+        </w:rPr>
+        <w:t>(6.67%)</w:t>
+      </w:r>
+      <w:r>
+        <w:rPr>
+          <w:rFonts w:eastAsiaTheme="minorEastAsia"/>
+          <w:b/>
+          <w:bCs/>
+          <w:color w:val="215868" w:themeColor="accent5" w:themeShade="80"/>
+          <w:lang w:eastAsia="zh-CN"/>
+        </w:rPr>
+        <w:t>、护理记录缺项、漏项、记录不</w:t>
+      </w:r>
+      <w:proofErr w:type="gramStart"/>
+      <w:r>
+        <w:rPr>
+          <w:rFonts w:eastAsiaTheme="minorEastAsia"/>
+          <w:b/>
+          <w:bCs/>
+          <w:color w:val="215868" w:themeColor="accent5" w:themeShade="80"/>
+          <w:lang w:eastAsia="zh-CN"/>
+        </w:rPr>
+        <w:t>完整</w:t>
+      </w:r>
+      <w:r>
+        <w:rPr>
+          <w:rFonts w:eastAsiaTheme="minorEastAsia"/>
+          <w:b/>
+          <w:bCs/>
+          <w:color w:val="215868" w:themeColor="accent5" w:themeShade="80"/>
+          <w:lang w:eastAsia="zh-CN"/>
+        </w:rPr>
+        <w:t>(</w:t>
+      </w:r>
+      <w:proofErr w:type="gramEnd"/>
+      <w:r>
+        <w:rPr>
+          <w:rFonts w:eastAsiaTheme="minorEastAsia"/>
+          <w:b/>
+          <w:bCs/>
+          <w:color w:val="215868" w:themeColor="accent5" w:themeShade="80"/>
+          <w:lang w:eastAsia="zh-CN"/>
+        </w:rPr>
+        <w:t>3.33%)</w:t>
+      </w:r>
+      <w:r>
+        <w:rPr>
+          <w:rFonts w:eastAsiaTheme="minorEastAsia"/>
+          <w:b/>
+          <w:bCs/>
+          <w:color w:val="215868" w:themeColor="accent5" w:themeShade="80"/>
+          <w:lang w:eastAsia="zh-CN"/>
+        </w:rPr>
+        <w:t>、护理记录复制</w:t>
+      </w:r>
+      <w:r>
+        <w:rPr>
+          <w:rFonts w:eastAsiaTheme="minorEastAsia"/>
+          <w:b/>
+          <w:bCs/>
+          <w:color w:val="215868" w:themeColor="accent5" w:themeShade="80"/>
+          <w:lang w:eastAsia="zh-CN"/>
+        </w:rPr>
+        <w:t>(3.33%)</w:t>
+      </w:r>
+      <w:r>
+        <w:rPr>
+          <w:rFonts w:eastAsiaTheme="minorEastAsia"/>
+          <w:b/>
+          <w:bCs/>
+          <w:color w:val="215868" w:themeColor="accent5" w:themeShade="80"/>
+          <w:lang w:eastAsia="zh-CN"/>
+        </w:rPr>
+        <w:t>、病情动态评估与描述不准确</w:t>
+      </w:r>
+      <w:r>
+        <w:rPr>
+          <w:rFonts w:eastAsiaTheme="minorEastAsia"/>
+          <w:b/>
+          <w:bCs/>
+          <w:color w:val="215868" w:themeColor="accent5" w:themeShade="80"/>
+          <w:lang w:eastAsia="zh-CN"/>
+        </w:rPr>
+        <w:t>(5.00%)</w:t>
+      </w:r>
+      <w:r>
+        <w:rPr>
+          <w:rFonts w:eastAsiaTheme="minorEastAsia"/>
+          <w:b/>
+          <w:bCs/>
+          <w:color w:val="215868" w:themeColor="accent5" w:themeShade="80"/>
+          <w:lang w:eastAsia="zh-CN"/>
+        </w:rPr>
+        <w:t>、与医师记录不一致</w:t>
+      </w:r>
+      <w:r>
+        <w:rPr>
+          <w:rFonts w:eastAsiaTheme="minorEastAsia"/>
+          <w:b/>
+          <w:bCs/>
+          <w:color w:val="215868" w:themeColor="accent5" w:themeShade="80"/>
+          <w:lang w:eastAsia="zh-CN"/>
+        </w:rPr>
+        <w:t>(3.33%)</w:t>
+      </w:r>
+      <w:r>
+        <w:rPr>
+          <w:rFonts w:eastAsiaTheme="minorEastAsia"/>
+          <w:b/>
+          <w:bCs/>
+          <w:color w:val="215868" w:themeColor="accent5" w:themeShade="80"/>
+          <w:lang w:eastAsia="zh-CN"/>
+        </w:rPr>
+        <w:t>及未体现专科特色</w:t>
+      </w:r>
+      <w:r>
+        <w:rPr>
+          <w:rFonts w:eastAsiaTheme="minorEastAsia"/>
+          <w:b/>
+          <w:bCs/>
+          <w:color w:val="215868" w:themeColor="accent5" w:themeShade="80"/>
+          <w:lang w:eastAsia="zh-CN"/>
+        </w:rPr>
+        <w:t>(3.33%)</w:t>
+      </w:r>
+      <w:r>
+        <w:rPr>
+          <w:rFonts w:eastAsiaTheme="minorEastAsia"/>
+          <w:b/>
+          <w:bCs/>
+          <w:color w:val="215868" w:themeColor="accent5" w:themeShade="80"/>
+          <w:lang w:eastAsia="zh-CN"/>
+        </w:rPr>
+        <w:t>的发生率</w:t>
+      </w:r>
+      <w:r>
+        <w:rPr>
+          <w:rFonts w:eastAsiaTheme="minorEastAsia" w:hint="eastAsia"/>
+          <w:b/>
+          <w:bCs/>
+          <w:color w:val="215868" w:themeColor="accent5" w:themeShade="80"/>
+          <w:lang w:val="en-US" w:eastAsia="zh-CN"/>
+        </w:rPr>
+        <w:t>[</w:t>
+      </w:r>
+      <w:r>
+        <w:rPr>
+          <w:rFonts w:eastAsiaTheme="minorEastAsia" w:hint="eastAsia"/>
+          <w:b/>
+          <w:bCs/>
+          <w:color w:val="215868" w:themeColor="accent5" w:themeShade="80"/>
+          <w:lang w:val="en-US" w:eastAsia="zh-CN"/>
+        </w:rPr>
+        <w:t>2</w:t>
+      </w:r>
+      <w:r>
+        <w:rPr>
+          <w:rFonts w:eastAsiaTheme="minorEastAsia" w:hint="eastAsia"/>
+          <w:b/>
+          <w:bCs/>
+          <w:color w:val="215868" w:themeColor="accent5" w:themeShade="80"/>
+          <w:lang w:val="en-US" w:eastAsia="zh-CN"/>
+        </w:rPr>
+        <w:t>]</w:t>
+      </w:r>
+      <w:r>
+        <w:rPr>
+          <w:rFonts w:eastAsiaTheme="minorEastAsia" w:hint="eastAsia"/>
+          <w:b/>
+          <w:bCs/>
+          <w:color w:val="215868" w:themeColor="accent5" w:themeShade="80"/>
+          <w:lang w:val="en-GB" w:eastAsia="zh-CN"/>
+        </w:rPr>
+        <w:t xml:space="preserve"> </w:t>
+      </w:r>
+      <w:r>
+        <w:rPr>
+          <w:rFonts w:eastAsiaTheme="minorEastAsia" w:hint="eastAsia"/>
+          <w:b/>
+          <w:bCs/>
+          <w:color w:val="215868" w:themeColor="accent5" w:themeShade="80"/>
+          <w:lang w:val="en-GB" w:eastAsia="zh-CN"/>
+        </w:rPr>
+        <w:t>。这些文书的缺陷，直接影响病历的真实性以及法律效应，更是</w:t>
       </w:r>
       <w:r>
         <w:rPr>
@@ -1654,86 +1968,572 @@
         </w:rPr>
         <w:t>。</w:t>
       </w:r>
-      <w:r>
-        <w:rPr>
-          <w:rFonts w:eastAsiaTheme="minorEastAsia" w:hint="eastAsia"/>
-          <w:b/>
-          <w:bCs/>
-          <w:color w:val="215868" w:themeColor="accent5" w:themeShade="80"/>
-          <w:lang w:val="en-GB" w:eastAsia="zh-CN"/>
-        </w:rPr>
-        <w:t>一项基于</w:t>
-      </w:r>
-      <w:r>
-        <w:rPr>
-          <w:rFonts w:eastAsiaTheme="minorEastAsia" w:hint="eastAsia"/>
-          <w:b/>
-          <w:bCs/>
-          <w:color w:val="215868" w:themeColor="accent5" w:themeShade="80"/>
-          <w:lang w:val="en-GB" w:eastAsia="zh-CN"/>
-        </w:rPr>
-        <w:t>首都儿科研究所附属儿童医院</w:t>
-      </w:r>
-      <w:r>
-        <w:rPr>
-          <w:rFonts w:eastAsiaTheme="minorEastAsia" w:hint="eastAsia"/>
-          <w:b/>
-          <w:bCs/>
-          <w:color w:val="215868" w:themeColor="accent5" w:themeShade="80"/>
-          <w:lang w:val="en-GB" w:eastAsia="zh-CN"/>
-        </w:rPr>
-        <w:t>的研究，</w:t>
-      </w:r>
-      <w:r>
-        <w:rPr>
-          <w:rFonts w:eastAsiaTheme="minorEastAsia" w:hint="eastAsia"/>
+    </w:p>
+    <w:p>
+      <w:pPr>
+        <w:spacing w:line="276" w:lineRule="auto"/>
+        <w:ind w:left="0" w:hanging="2"/>
+        <w:rPr>
+          <w:rFonts w:eastAsiaTheme="minorEastAsia" w:hint="eastAsia"/>
+          <w:b/>
+          <w:bCs/>
+          <w:color w:val="215868" w:themeColor="accent5" w:themeShade="80"/>
+          <w:lang w:val="en-GB" w:eastAsia="zh-CN"/>
+        </w:rPr>
+      </w:pPr>
+    </w:p>
+    <w:p>
+      <w:pPr>
+        <w:spacing w:line="276" w:lineRule="auto"/>
+        <w:ind w:leftChars="0" w:left="0" w:firstLineChars="0" w:firstLine="0"/>
+        <w:rPr>
+          <w:rFonts w:eastAsiaTheme="minorEastAsia"/>
           <w:b/>
           <w:bCs/>
           <w:color w:val="215868" w:themeColor="accent5" w:themeShade="80"/>
           <w:lang w:eastAsia="zh-CN"/>
         </w:rPr>
-        <w:t>常见的缺陷类型以及发生率分别是为：</w:t>
-      </w:r>
-      <w:r>
-        <w:rPr>
-          <w:rFonts w:eastAsiaTheme="minorEastAsia"/>
+      </w:pPr>
+      <w:r>
+        <w:rPr>
+          <w:rFonts w:eastAsiaTheme="minorEastAsia" w:hint="eastAsia"/>
           <w:b/>
           <w:bCs/>
           <w:color w:val="215868" w:themeColor="accent5" w:themeShade="80"/>
           <w:lang w:eastAsia="zh-CN"/>
         </w:rPr>
-        <w:t>风险评估不合格</w:t>
-      </w:r>
-      <w:r>
-        <w:rPr>
-          <w:rFonts w:eastAsiaTheme="minorEastAsia"/>
+        <w:t>传统医疗文本质</w:t>
+      </w:r>
+      <w:proofErr w:type="gramStart"/>
+      <w:r>
+        <w:rPr>
+          <w:rFonts w:eastAsiaTheme="minorEastAsia" w:hint="eastAsia"/>
           <w:b/>
           <w:bCs/>
           <w:color w:val="215868" w:themeColor="accent5" w:themeShade="80"/>
           <w:lang w:eastAsia="zh-CN"/>
         </w:rPr>
-        <w:t>(6.67%)</w:t>
-      </w:r>
-      <w:r>
-        <w:rPr>
-          <w:rFonts w:eastAsiaTheme="minorEastAsia"/>
+        <w:t>控方法</w:t>
+      </w:r>
+      <w:proofErr w:type="gramEnd"/>
+      <w:r>
+        <w:rPr>
+          <w:rFonts w:eastAsiaTheme="minorEastAsia" w:hint="eastAsia"/>
           <w:b/>
           <w:bCs/>
           <w:color w:val="215868" w:themeColor="accent5" w:themeShade="80"/>
           <w:lang w:eastAsia="zh-CN"/>
         </w:rPr>
-        <w:t>、护理记录缺项、漏项、记录不</w:t>
+        <w:t>主要依赖预设规则库和传统的分类模型。</w:t>
+      </w:r>
+      <w:r>
+        <w:rPr>
+          <w:rFonts w:eastAsiaTheme="minorEastAsia" w:hint="eastAsia"/>
+          <w:b/>
+          <w:bCs/>
+          <w:color w:val="215868" w:themeColor="accent5" w:themeShade="80"/>
+          <w:lang w:eastAsia="zh-CN"/>
+        </w:rPr>
+        <w:t>规则库方法难以处理病历中复杂的语义关联和上下文依赖，导致质控精准度有限；分类模型则受限于特征表达能力，对异常文本的识别效果不佳。</w:t>
+      </w:r>
+    </w:p>
+    <w:p>
+      <w:pPr>
+        <w:spacing w:line="276" w:lineRule="auto"/>
+        <w:ind w:leftChars="0" w:left="0" w:firstLineChars="0" w:firstLine="0"/>
+        <w:rPr>
+          <w:rFonts w:eastAsiaTheme="minorEastAsia"/>
+          <w:b/>
+          <w:bCs/>
+          <w:color w:val="215868" w:themeColor="accent5" w:themeShade="80"/>
+          <w:lang w:val="en-US" w:eastAsia="zh-CN"/>
+        </w:rPr>
+      </w:pPr>
+      <w:r>
+        <w:rPr>
+          <w:rFonts w:eastAsiaTheme="minorEastAsia" w:hint="eastAsia"/>
+          <w:b/>
+          <w:bCs/>
+          <w:color w:val="FF0000"/>
+          <w:lang w:val="en-US" w:eastAsia="zh-CN"/>
+        </w:rPr>
+        <w:t>近年来，</w:t>
+      </w:r>
+      <w:r>
+        <w:rPr>
+          <w:rFonts w:eastAsiaTheme="minorEastAsia" w:hint="eastAsia"/>
+          <w:b/>
+          <w:bCs/>
+          <w:color w:val="FF0000"/>
+          <w:lang w:val="en-US" w:eastAsia="zh-CN"/>
+        </w:rPr>
+        <w:t>大语言模型</w:t>
+      </w:r>
+      <w:r>
+        <w:rPr>
+          <w:rFonts w:eastAsiaTheme="minorEastAsia" w:hint="eastAsia"/>
+          <w:b/>
+          <w:bCs/>
+          <w:color w:val="215868" w:themeColor="accent5" w:themeShade="80"/>
+          <w:lang w:val="en-US" w:eastAsia="zh-CN"/>
+        </w:rPr>
+        <w:t>在医疗文本处理中展示出强大的潜力，但</w:t>
+      </w:r>
+      <w:r>
+        <w:rPr>
+          <w:rFonts w:eastAsiaTheme="minorEastAsia" w:hint="eastAsia"/>
+          <w:b/>
+          <w:bCs/>
+          <w:color w:val="215868" w:themeColor="accent5" w:themeShade="80"/>
+          <w:lang w:val="en-US" w:eastAsia="zh-CN"/>
+        </w:rPr>
+        <w:t>其</w:t>
+      </w:r>
+      <w:r>
+        <w:rPr>
+          <w:rFonts w:eastAsiaTheme="minorEastAsia" w:hint="eastAsia"/>
+          <w:b/>
+          <w:bCs/>
+          <w:color w:val="215868" w:themeColor="accent5" w:themeShade="80"/>
+          <w:lang w:val="en-US" w:eastAsia="zh-CN"/>
+        </w:rPr>
+        <w:t>高昂</w:t>
       </w:r>
       <w:proofErr w:type="gramStart"/>
       <w:r>
         <w:rPr>
+          <w:rFonts w:eastAsiaTheme="minorEastAsia" w:hint="eastAsia"/>
+          <w:b/>
+          <w:bCs/>
+          <w:color w:val="215868" w:themeColor="accent5" w:themeShade="80"/>
+          <w:lang w:val="en-US" w:eastAsia="zh-CN"/>
+        </w:rPr>
+        <w:t>的</w:t>
+      </w:r>
+      <w:r>
+        <w:rPr>
+          <w:rFonts w:eastAsiaTheme="minorEastAsia" w:hint="eastAsia"/>
+          <w:b/>
+          <w:bCs/>
+          <w:color w:val="215868" w:themeColor="accent5" w:themeShade="80"/>
+          <w:lang w:val="en-US" w:eastAsia="zh-CN"/>
+        </w:rPr>
+        <w:t>算力成本</w:t>
+      </w:r>
+      <w:proofErr w:type="gramEnd"/>
+      <w:r>
+        <w:rPr>
+          <w:rFonts w:eastAsiaTheme="minorEastAsia" w:hint="eastAsia"/>
+          <w:b/>
+          <w:bCs/>
+          <w:color w:val="215868" w:themeColor="accent5" w:themeShade="80"/>
+          <w:lang w:val="en-US" w:eastAsia="zh-CN"/>
+        </w:rPr>
+        <w:t>、参数量大、推理成本高，</w:t>
+      </w:r>
+      <w:r>
+        <w:rPr>
+          <w:rFonts w:eastAsiaTheme="minorEastAsia" w:hint="eastAsia"/>
+          <w:b/>
+          <w:bCs/>
+          <w:color w:val="215868" w:themeColor="accent5" w:themeShade="80"/>
+          <w:lang w:val="en-US" w:eastAsia="zh-CN"/>
+        </w:rPr>
+        <w:t>需要提供标注文本供模型学习</w:t>
+      </w:r>
+      <w:r>
+        <w:rPr>
+          <w:rFonts w:eastAsiaTheme="minorEastAsia" w:hint="eastAsia"/>
+          <w:b/>
+          <w:bCs/>
+          <w:color w:val="215868" w:themeColor="accent5" w:themeShade="80"/>
+          <w:lang w:val="en-US" w:eastAsia="zh-CN"/>
+        </w:rPr>
+        <w:t>，限制了在基层医院的推广应用。</w:t>
+      </w:r>
+      <w:r>
+        <w:rPr>
+          <w:rFonts w:eastAsiaTheme="minorEastAsia" w:hint="eastAsia"/>
+          <w:b/>
+          <w:bCs/>
+          <w:color w:val="215868" w:themeColor="accent5" w:themeShade="80"/>
+          <w:lang w:val="en-US" w:eastAsia="zh-CN"/>
+        </w:rPr>
+        <w:t>考虑到医院</w:t>
+      </w:r>
+      <w:proofErr w:type="gramStart"/>
+      <w:r>
+        <w:rPr>
+          <w:rFonts w:eastAsiaTheme="minorEastAsia" w:hint="eastAsia"/>
+          <w:b/>
+          <w:bCs/>
+          <w:color w:val="215868" w:themeColor="accent5" w:themeShade="80"/>
+          <w:lang w:val="en-US" w:eastAsia="zh-CN"/>
+        </w:rPr>
+        <w:t>算力层本</w:t>
+      </w:r>
+      <w:proofErr w:type="gramEnd"/>
+      <w:r>
+        <w:rPr>
+          <w:rFonts w:eastAsiaTheme="minorEastAsia" w:hint="eastAsia"/>
+          <w:b/>
+          <w:bCs/>
+          <w:color w:val="215868" w:themeColor="accent5" w:themeShade="80"/>
+          <w:lang w:val="en-US" w:eastAsia="zh-CN"/>
+        </w:rPr>
+        <w:t>以及标注数据有限</w:t>
+      </w:r>
+      <w:r>
+        <w:rPr>
+          <w:rFonts w:eastAsiaTheme="minorEastAsia" w:hint="eastAsia"/>
+          <w:b/>
+          <w:bCs/>
+          <w:color w:val="215868" w:themeColor="accent5" w:themeShade="80"/>
+          <w:lang w:val="en-US" w:eastAsia="zh-CN"/>
+        </w:rPr>
+        <w:t>，</w:t>
+      </w:r>
+      <w:proofErr w:type="gramStart"/>
+      <w:r>
+        <w:rPr>
+          <w:rFonts w:eastAsiaTheme="minorEastAsia" w:hint="eastAsia"/>
+          <w:b/>
+          <w:bCs/>
+          <w:color w:val="215868" w:themeColor="accent5" w:themeShade="80"/>
+          <w:lang w:val="en-US" w:eastAsia="zh-CN"/>
+        </w:rPr>
+        <w:t>预训练自编码</w:t>
+      </w:r>
+      <w:proofErr w:type="gramEnd"/>
+      <w:r>
+        <w:rPr>
+          <w:rFonts w:eastAsiaTheme="minorEastAsia" w:hint="eastAsia"/>
+          <w:b/>
+          <w:bCs/>
+          <w:color w:val="215868" w:themeColor="accent5" w:themeShade="80"/>
+          <w:lang w:val="en-US" w:eastAsia="zh-CN"/>
+        </w:rPr>
+        <w:t>模型</w:t>
+      </w:r>
+      <w:r>
+        <w:rPr>
+          <w:rFonts w:eastAsiaTheme="minorEastAsia" w:hint="eastAsia"/>
+          <w:b/>
+          <w:bCs/>
+          <w:color w:val="215868" w:themeColor="accent5" w:themeShade="80"/>
+          <w:lang w:val="en-US" w:eastAsia="zh-CN"/>
+        </w:rPr>
+        <w:t>（如</w:t>
+      </w:r>
+      <w:r>
+        <w:rPr>
+          <w:rFonts w:eastAsiaTheme="minorEastAsia" w:hint="eastAsia"/>
+          <w:b/>
+          <w:bCs/>
+          <w:color w:val="215868" w:themeColor="accent5" w:themeShade="80"/>
+          <w:lang w:val="en-US" w:eastAsia="zh-CN"/>
+        </w:rPr>
+        <w:t>BERT</w:t>
+      </w:r>
+      <w:r>
+        <w:rPr>
+          <w:rFonts w:eastAsiaTheme="minorEastAsia" w:hint="eastAsia"/>
+          <w:b/>
+          <w:bCs/>
+          <w:color w:val="215868" w:themeColor="accent5" w:themeShade="80"/>
+          <w:lang w:val="en-US" w:eastAsia="zh-CN"/>
+        </w:rPr>
+        <w:t>）</w:t>
+      </w:r>
+      <w:r>
+        <w:rPr>
+          <w:rFonts w:eastAsiaTheme="minorEastAsia" w:hint="eastAsia"/>
+          <w:b/>
+          <w:bCs/>
+          <w:color w:val="215868" w:themeColor="accent5" w:themeShade="80"/>
+          <w:lang w:val="en-US" w:eastAsia="zh-CN"/>
+        </w:rPr>
+        <w:t>因其参数量较小、</w:t>
+      </w:r>
+      <w:r>
+        <w:rPr>
+          <w:rFonts w:eastAsiaTheme="minorEastAsia" w:hint="eastAsia"/>
+          <w:b/>
+          <w:bCs/>
+          <w:color w:val="215868" w:themeColor="accent5" w:themeShade="80"/>
+          <w:lang w:val="en-US" w:eastAsia="zh-CN"/>
+        </w:rPr>
+        <w:t>推理成本低，</w:t>
+      </w:r>
+      <w:r>
+        <w:rPr>
+          <w:rFonts w:eastAsiaTheme="minorEastAsia" w:hint="eastAsia"/>
+          <w:b/>
+          <w:bCs/>
+          <w:color w:val="215868" w:themeColor="accent5" w:themeShade="80"/>
+          <w:lang w:val="en-US" w:eastAsia="zh-CN"/>
+        </w:rPr>
+        <w:t>部署门槛低</w:t>
+      </w:r>
+      <w:r>
+        <w:rPr>
+          <w:rFonts w:eastAsiaTheme="minorEastAsia" w:hint="eastAsia"/>
+          <w:b/>
+          <w:bCs/>
+          <w:color w:val="215868" w:themeColor="accent5" w:themeShade="80"/>
+          <w:lang w:val="en-US" w:eastAsia="zh-CN"/>
+        </w:rPr>
+        <w:t>，</w:t>
+      </w:r>
+      <w:r>
+        <w:rPr>
+          <w:rFonts w:eastAsiaTheme="minorEastAsia" w:hint="eastAsia"/>
+          <w:b/>
+          <w:bCs/>
+          <w:color w:val="215868" w:themeColor="accent5" w:themeShade="80"/>
+          <w:lang w:val="en-US" w:eastAsia="zh-CN"/>
+        </w:rPr>
+        <w:t>微调</w:t>
+      </w:r>
+      <w:r>
+        <w:rPr>
+          <w:rFonts w:eastAsiaTheme="minorEastAsia" w:hint="eastAsia"/>
+          <w:b/>
+          <w:bCs/>
+          <w:color w:val="215868" w:themeColor="accent5" w:themeShade="80"/>
+          <w:lang w:val="en-US" w:eastAsia="zh-CN"/>
+        </w:rPr>
+        <w:t>所需</w:t>
+      </w:r>
+      <w:r>
+        <w:rPr>
+          <w:rFonts w:eastAsiaTheme="minorEastAsia" w:hint="eastAsia"/>
+          <w:b/>
+          <w:bCs/>
+          <w:color w:val="215868" w:themeColor="accent5" w:themeShade="80"/>
+          <w:lang w:val="en-US" w:eastAsia="zh-CN"/>
+        </w:rPr>
+        <w:t>的标注</w:t>
+      </w:r>
+      <w:r>
+        <w:rPr>
+          <w:rFonts w:eastAsiaTheme="minorEastAsia" w:hint="eastAsia"/>
+          <w:b/>
+          <w:bCs/>
+          <w:color w:val="215868" w:themeColor="accent5" w:themeShade="80"/>
+          <w:lang w:val="en-US" w:eastAsia="zh-CN"/>
+        </w:rPr>
+        <w:t>数据相对较</w:t>
+      </w:r>
+      <w:r>
+        <w:rPr>
+          <w:rFonts w:eastAsiaTheme="minorEastAsia" w:hint="eastAsia"/>
+          <w:b/>
+          <w:bCs/>
+          <w:color w:val="215868" w:themeColor="accent5" w:themeShade="80"/>
+          <w:lang w:val="en-US" w:eastAsia="zh-CN"/>
+        </w:rPr>
+        <w:t>少</w:t>
+      </w:r>
+      <w:r>
+        <w:rPr>
+          <w:rFonts w:eastAsiaTheme="minorEastAsia" w:hint="eastAsia"/>
+          <w:b/>
+          <w:bCs/>
+          <w:color w:val="215868" w:themeColor="accent5" w:themeShade="80"/>
+          <w:lang w:val="en-US" w:eastAsia="zh-CN"/>
+        </w:rPr>
+        <w:t>，</w:t>
+      </w:r>
+      <w:r>
+        <w:rPr>
+          <w:rFonts w:eastAsiaTheme="minorEastAsia" w:hint="eastAsia"/>
+          <w:b/>
+          <w:bCs/>
+          <w:color w:val="215868" w:themeColor="accent5" w:themeShade="80"/>
+          <w:lang w:val="en-US" w:eastAsia="zh-CN"/>
+        </w:rPr>
+        <w:t>在医疗文本异常检测任务中展现出独特优势。</w:t>
+      </w:r>
+      <w:r>
+        <w:rPr>
+          <w:rFonts w:eastAsiaTheme="minorEastAsia" w:hint="eastAsia"/>
+          <w:b/>
+          <w:bCs/>
+          <w:color w:val="215868" w:themeColor="accent5" w:themeShade="80"/>
+          <w:lang w:val="en-US" w:eastAsia="zh-CN"/>
+        </w:rPr>
+        <w:t>然而，</w:t>
+      </w:r>
+      <w:r>
+        <w:rPr>
+          <w:rFonts w:eastAsiaTheme="minorEastAsia" w:hint="eastAsia"/>
+          <w:b/>
+          <w:bCs/>
+          <w:color w:val="215868" w:themeColor="accent5" w:themeShade="80"/>
+          <w:lang w:val="en-US" w:eastAsia="zh-CN"/>
+        </w:rPr>
+        <w:t>BERT</w:t>
+      </w:r>
+      <w:r>
+        <w:rPr>
+          <w:rFonts w:eastAsiaTheme="minorEastAsia" w:hint="eastAsia"/>
+          <w:b/>
+          <w:bCs/>
+          <w:color w:val="215868" w:themeColor="accent5" w:themeShade="80"/>
+          <w:lang w:val="en-US" w:eastAsia="zh-CN"/>
+        </w:rPr>
+        <w:t>在生成任务上能力有限，且对长文本语义捕捉能力有限，</w:t>
+      </w:r>
+      <w:r>
+        <w:rPr>
+          <w:rFonts w:eastAsiaTheme="minorEastAsia" w:hint="eastAsia"/>
+          <w:b/>
+          <w:bCs/>
+          <w:color w:val="215868" w:themeColor="accent5" w:themeShade="80"/>
+          <w:lang w:val="en-US" w:eastAsia="zh-CN"/>
+        </w:rPr>
+        <w:t>且对长文本语义的捕捉能力弱于大语言模型，需结合具体任务设计</w:t>
+      </w:r>
+      <w:proofErr w:type="gramStart"/>
+      <w:r>
+        <w:rPr>
+          <w:rFonts w:eastAsiaTheme="minorEastAsia" w:hint="eastAsia"/>
+          <w:b/>
+          <w:bCs/>
+          <w:color w:val="215868" w:themeColor="accent5" w:themeShade="80"/>
+          <w:lang w:val="en-US" w:eastAsia="zh-CN"/>
+        </w:rPr>
+        <w:t>适</w:t>
+      </w:r>
+      <w:proofErr w:type="gramEnd"/>
+      <w:r>
+        <w:rPr>
+          <w:rFonts w:eastAsiaTheme="minorEastAsia" w:hint="eastAsia"/>
+          <w:b/>
+          <w:bCs/>
+          <w:color w:val="215868" w:themeColor="accent5" w:themeShade="80"/>
+          <w:lang w:val="en-US" w:eastAsia="zh-CN"/>
+        </w:rPr>
+        <w:t>配方案。</w:t>
+      </w:r>
+      <w:r>
+        <w:rPr>
+          <w:rFonts w:eastAsiaTheme="minorEastAsia" w:hint="eastAsia"/>
+          <w:b/>
+          <w:bCs/>
+          <w:color w:val="215868" w:themeColor="accent5" w:themeShade="80"/>
+          <w:lang w:val="en-US" w:eastAsia="zh-CN"/>
+        </w:rPr>
+        <w:t>本研究将</w:t>
+      </w:r>
+      <w:proofErr w:type="gramStart"/>
+      <w:r>
+        <w:rPr>
+          <w:rFonts w:eastAsiaTheme="minorEastAsia" w:hint="eastAsia"/>
+          <w:b/>
+          <w:bCs/>
+          <w:color w:val="215868" w:themeColor="accent5" w:themeShade="80"/>
+          <w:lang w:val="en-US" w:eastAsia="zh-CN"/>
+        </w:rPr>
+        <w:t>预训练自编码</w:t>
+      </w:r>
+      <w:proofErr w:type="gramEnd"/>
+      <w:r>
+        <w:rPr>
+          <w:rFonts w:eastAsiaTheme="minorEastAsia" w:hint="eastAsia"/>
+          <w:b/>
+          <w:bCs/>
+          <w:color w:val="215868" w:themeColor="accent5" w:themeShade="80"/>
+          <w:lang w:val="en-US" w:eastAsia="zh-CN"/>
+        </w:rPr>
+        <w:t>模型引入护理文书质控领域</w:t>
+      </w:r>
+      <w:r>
+        <w:rPr>
+          <w:rFonts w:eastAsiaTheme="minorEastAsia" w:hint="eastAsia"/>
+          <w:b/>
+          <w:bCs/>
+          <w:color w:val="215868" w:themeColor="accent5" w:themeShade="80"/>
+          <w:lang w:val="en-US" w:eastAsia="zh-CN"/>
+        </w:rPr>
+        <w:t>，重点解决以下两个关键问题：</w:t>
+      </w:r>
+    </w:p>
+    <w:p>
+      <w:pPr>
+        <w:spacing w:line="276" w:lineRule="auto"/>
+        <w:ind w:left="0" w:hanging="2"/>
+        <w:rPr>
+          <w:rFonts w:eastAsiaTheme="minorEastAsia" w:hint="eastAsia"/>
+          <w:b/>
+          <w:bCs/>
+          <w:color w:val="215868" w:themeColor="accent5" w:themeShade="80"/>
+          <w:lang w:val="en-US" w:eastAsia="zh-CN"/>
+        </w:rPr>
+      </w:pPr>
+    </w:p>
+    <w:p>
+      <w:pPr>
+        <w:spacing w:line="276" w:lineRule="auto"/>
+        <w:ind w:left="-2" w:firstLineChars="0" w:firstLine="0"/>
+        <w:rPr>
           <w:rFonts w:eastAsiaTheme="minorEastAsia"/>
           <w:b/>
           <w:bCs/>
           <w:color w:val="215868" w:themeColor="accent5" w:themeShade="80"/>
           <w:lang w:eastAsia="zh-CN"/>
         </w:rPr>
-        <w:t>完整</w:t>
+      </w:pPr>
+      <w:r>
+        <w:rPr>
+          <w:rFonts w:eastAsiaTheme="minorEastAsia"/>
+          <w:b/>
+          <w:bCs/>
+          <w:color w:val="215868" w:themeColor="accent5" w:themeShade="80"/>
+          <w:lang w:val="en-US" w:eastAsia="zh-CN"/>
+        </w:rPr>
+        <w:t>一是</w:t>
+      </w:r>
+      <w:r>
+        <w:rPr>
+          <w:rFonts w:eastAsiaTheme="minorEastAsia" w:hint="eastAsia"/>
+          <w:b/>
+          <w:bCs/>
+          <w:color w:val="215868" w:themeColor="accent5" w:themeShade="80"/>
+          <w:lang w:val="en-US" w:eastAsia="zh-CN"/>
+        </w:rPr>
+        <w:t>如何通过在有限的标注数据下快速构建高效的护理文书质控模型</w:t>
+      </w:r>
+      <w:r>
+        <w:rPr>
+          <w:rFonts w:eastAsiaTheme="minorEastAsia" w:hint="eastAsia"/>
+          <w:b/>
+          <w:bCs/>
+          <w:color w:val="215868" w:themeColor="accent5" w:themeShade="80"/>
+          <w:lang w:val="en-US" w:eastAsia="zh-CN"/>
+        </w:rPr>
+        <w:t>。通过电子病历护理文书为基础，通过</w:t>
+      </w:r>
+      <w:r>
+        <w:rPr>
+          <w:rFonts w:eastAsiaTheme="minorEastAsia" w:hint="eastAsia"/>
+          <w:b/>
+          <w:bCs/>
+          <w:color w:val="215868" w:themeColor="accent5" w:themeShade="80"/>
+          <w:lang w:val="en-US" w:eastAsia="zh-CN"/>
+        </w:rPr>
+        <w:t>人工标注构建训练数据集</w:t>
+      </w:r>
+      <w:r>
+        <w:rPr>
+          <w:rFonts w:eastAsiaTheme="minorEastAsia" w:hint="eastAsia"/>
+          <w:b/>
+          <w:bCs/>
+          <w:color w:val="215868" w:themeColor="accent5" w:themeShade="80"/>
+          <w:lang w:val="en-US" w:eastAsia="zh-CN"/>
+        </w:rPr>
+        <w:t>，在</w:t>
       </w:r>
       <w:r>
         <w:rPr>
@@ -1743,139 +2543,2078 @@
           <w:color w:val="215868" w:themeColor="accent5" w:themeShade="80"/>
           <w:lang w:eastAsia="zh-CN"/>
         </w:rPr>
+        <w:t xml:space="preserve">bert-base-chinese </w:t>
+      </w:r>
+      <w:r>
+        <w:rPr>
+          <w:rFonts w:eastAsiaTheme="minorEastAsia"/>
+          <w:b/>
+          <w:bCs/>
+          <w:color w:val="215868" w:themeColor="accent5" w:themeShade="80"/>
+          <w:lang w:eastAsia="zh-CN"/>
+        </w:rPr>
+        <w:t>模型基础上</w:t>
+      </w:r>
+      <w:r>
+        <w:rPr>
+          <w:rFonts w:eastAsiaTheme="minorEastAsia" w:hint="eastAsia"/>
+          <w:b/>
+          <w:bCs/>
+          <w:color w:val="215868" w:themeColor="accent5" w:themeShade="80"/>
+          <w:lang w:eastAsia="zh-CN"/>
+        </w:rPr>
+        <w:t>进行微调，</w:t>
+      </w:r>
+      <w:r>
+        <w:rPr>
+          <w:rFonts w:eastAsiaTheme="minorEastAsia" w:hint="eastAsia"/>
+          <w:b/>
+          <w:bCs/>
+          <w:color w:val="215868" w:themeColor="accent5" w:themeShade="80"/>
+          <w:lang w:eastAsia="zh-CN"/>
+        </w:rPr>
+        <w:t>构建护理文书事件抽取模型</w:t>
+      </w:r>
+      <w:r>
+        <w:rPr>
+          <w:rFonts w:eastAsiaTheme="minorEastAsia" w:hint="eastAsia"/>
+          <w:b/>
+          <w:bCs/>
+          <w:color w:val="215868" w:themeColor="accent5" w:themeShade="80"/>
+          <w:lang w:eastAsia="zh-CN"/>
+        </w:rPr>
+        <w:t>。</w:t>
+      </w:r>
+    </w:p>
+    <w:p>
+      <w:pPr>
+        <w:spacing w:line="276" w:lineRule="auto"/>
+        <w:ind w:left="-2" w:firstLineChars="0" w:firstLine="0"/>
+        <w:rPr>
+          <w:rFonts w:eastAsiaTheme="minorEastAsia"/>
+          <w:b/>
+          <w:bCs/>
+          <w:color w:val="215868" w:themeColor="accent5" w:themeShade="80"/>
+          <w:lang w:eastAsia="zh-CN"/>
+        </w:rPr>
+      </w:pPr>
+      <w:r>
+        <w:rPr>
+          <w:rFonts w:eastAsiaTheme="minorEastAsia" w:hint="eastAsia"/>
+          <w:b/>
+          <w:bCs/>
+          <w:color w:val="215868" w:themeColor="accent5" w:themeShade="80"/>
+          <w:lang w:eastAsia="zh-CN"/>
+        </w:rPr>
+        <w:t>二是，如何利用医院海量的未标注的护理文书来提升模型对文书的质控的感知度。</w:t>
+      </w:r>
+      <w:r>
+        <w:rPr>
+          <w:rFonts w:eastAsiaTheme="minorEastAsia" w:hint="eastAsia"/>
+          <w:b/>
+          <w:bCs/>
+          <w:color w:val="215868" w:themeColor="accent5" w:themeShade="80"/>
+          <w:lang w:eastAsia="zh-CN"/>
+        </w:rPr>
+        <w:t>该模型从护理记录的中观察与记录中识别关键事件。</w:t>
+      </w:r>
+      <w:r>
+        <w:rPr>
+          <w:rFonts w:eastAsiaTheme="minorEastAsia" w:hint="eastAsia"/>
+          <w:b/>
+          <w:bCs/>
+          <w:color w:val="215868" w:themeColor="accent5" w:themeShade="80"/>
+          <w:lang w:eastAsia="zh-CN"/>
+        </w:rPr>
+        <w:t>以疼痛评估单</w:t>
+      </w:r>
+      <w:r>
+        <w:rPr>
+          <w:rFonts w:eastAsiaTheme="minorEastAsia" w:hint="eastAsia"/>
+          <w:b/>
+          <w:bCs/>
+          <w:color w:val="215868" w:themeColor="accent5" w:themeShade="80"/>
+          <w:lang w:eastAsia="zh-CN"/>
+        </w:rPr>
+        <w:t>质控</w:t>
+      </w:r>
+      <w:r>
+        <w:rPr>
+          <w:rFonts w:eastAsiaTheme="minorEastAsia" w:hint="eastAsia"/>
+          <w:b/>
+          <w:bCs/>
+          <w:color w:val="215868" w:themeColor="accent5" w:themeShade="80"/>
+          <w:lang w:eastAsia="zh-CN"/>
+        </w:rPr>
+        <w:t>为例</w:t>
+      </w:r>
+      <w:r>
+        <w:rPr>
+          <w:rFonts w:eastAsiaTheme="minorEastAsia" w:hint="eastAsia"/>
+          <w:b/>
+          <w:bCs/>
+          <w:color w:val="215868" w:themeColor="accent5" w:themeShade="80"/>
+          <w:lang w:eastAsia="zh-CN"/>
+        </w:rPr>
+        <w:t>，</w:t>
+      </w:r>
+      <w:r>
+        <w:rPr>
+          <w:rFonts w:eastAsiaTheme="minorEastAsia" w:hint="eastAsia"/>
+          <w:b/>
+          <w:bCs/>
+          <w:color w:val="215868" w:themeColor="accent5" w:themeShade="80"/>
+          <w:lang w:eastAsia="zh-CN"/>
+        </w:rPr>
+        <w:t>具体流程如下：首先，利用微调模型抽取护理记录观察与评估中的文书数据；其次，结合创建</w:t>
+      </w:r>
+      <w:r>
+        <w:rPr>
+          <w:rFonts w:eastAsiaTheme="minorEastAsia" w:hint="eastAsia"/>
+          <w:b/>
+          <w:bCs/>
+          <w:color w:val="215868" w:themeColor="accent5" w:themeShade="80"/>
+          <w:lang w:eastAsia="zh-CN"/>
+        </w:rPr>
+        <w:lastRenderedPageBreak/>
+        <w:t>此记录时间后小时内是否对应创建疼痛评估单事件；若存在药物使用记录但未检测到创建记录，则判定为质控违规并触发预警。</w:t>
+      </w:r>
+    </w:p>
+    <w:p>
+      <w:pPr>
+        <w:spacing w:line="276" w:lineRule="auto"/>
+        <w:ind w:left="-2" w:firstLineChars="0" w:firstLine="0"/>
+        <w:rPr>
+          <w:rFonts w:eastAsiaTheme="minorEastAsia" w:hint="eastAsia"/>
+          <w:b/>
+          <w:bCs/>
+          <w:color w:val="215868" w:themeColor="accent5" w:themeShade="80"/>
+          <w:lang w:val="en-US" w:eastAsia="zh-CN"/>
+        </w:rPr>
+      </w:pPr>
+      <w:r>
+        <w:rPr>
+          <w:rFonts w:eastAsiaTheme="minorEastAsia" w:hint="eastAsia"/>
+          <w:b/>
+          <w:bCs/>
+          <w:color w:val="215868" w:themeColor="accent5" w:themeShade="80"/>
+          <w:lang w:val="en-US" w:eastAsia="zh-CN"/>
+        </w:rPr>
+        <w:t xml:space="preserve"> </w:t>
+      </w:r>
+    </w:p>
+    <w:p>
+      <w:pPr>
+        <w:spacing w:line="276" w:lineRule="auto"/>
+        <w:ind w:left="0" w:hanging="2"/>
+        <w:rPr>
+          <w:rFonts w:eastAsiaTheme="minorEastAsia"/>
+          <w:b/>
+          <w:bCs/>
+          <w:color w:val="215868" w:themeColor="accent5" w:themeShade="80"/>
+          <w:lang w:val="en-US" w:eastAsia="zh-CN"/>
+        </w:rPr>
+      </w:pPr>
+      <w:r>
+        <w:rPr>
+          <w:rFonts w:eastAsiaTheme="minorEastAsia"/>
+          <w:b/>
+          <w:bCs/>
+          <w:color w:val="215868" w:themeColor="accent5" w:themeShade="80"/>
+          <w:lang w:val="en-US" w:eastAsia="zh-CN"/>
+        </w:rPr>
+        <w:t>二是如何通过重构误差机制，实现对语义异常和逻辑错误的精准识别。对于一份待检测的新文书，同样经过编码</w:t>
+      </w:r>
+      <w:r>
+        <w:rPr>
+          <w:rFonts w:eastAsiaTheme="minorEastAsia"/>
+          <w:b/>
+          <w:bCs/>
+          <w:color w:val="215868" w:themeColor="accent5" w:themeShade="80"/>
+          <w:lang w:val="en-US" w:eastAsia="zh-CN"/>
+        </w:rPr>
+        <w:t>-</w:t>
+      </w:r>
+      <w:r>
+        <w:rPr>
+          <w:rFonts w:eastAsiaTheme="minorEastAsia"/>
+          <w:b/>
+          <w:bCs/>
+          <w:color w:val="215868" w:themeColor="accent5" w:themeShade="80"/>
+          <w:lang w:val="en-US" w:eastAsia="zh-CN"/>
+        </w:rPr>
+        <w:t>解码流程得到其重建文本，并计算其与原始文本的重构误差。若该误差超过预设的阈值，则认为该文书存在潜在缺陷。其背后的逻辑是：模型在</w:t>
+      </w:r>
+      <w:proofErr w:type="gramStart"/>
+      <w:r>
+        <w:rPr>
+          <w:rFonts w:eastAsiaTheme="minorEastAsia"/>
+          <w:b/>
+          <w:bCs/>
+          <w:color w:val="215868" w:themeColor="accent5" w:themeShade="80"/>
+          <w:lang w:val="en-US" w:eastAsia="zh-CN"/>
+        </w:rPr>
+        <w:t>预训练</w:t>
+      </w:r>
+      <w:proofErr w:type="gramEnd"/>
+      <w:r>
+        <w:rPr>
+          <w:rFonts w:eastAsiaTheme="minorEastAsia"/>
+          <w:b/>
+          <w:bCs/>
+          <w:color w:val="215868" w:themeColor="accent5" w:themeShade="80"/>
+          <w:lang w:val="en-US" w:eastAsia="zh-CN"/>
+        </w:rPr>
+        <w:t>阶段仅接触过合格文书，因此当遇到不符合</w:t>
+      </w:r>
+      <w:r>
+        <w:rPr>
+          <w:rFonts w:eastAsiaTheme="minorEastAsia"/>
+          <w:b/>
+          <w:bCs/>
+          <w:color w:val="215868" w:themeColor="accent5" w:themeShade="80"/>
+          <w:lang w:val="en-US" w:eastAsia="zh-CN"/>
+        </w:rPr>
+        <w:t>“</w:t>
+      </w:r>
+      <w:r>
+        <w:rPr>
+          <w:rFonts w:eastAsiaTheme="minorEastAsia"/>
+          <w:b/>
+          <w:bCs/>
+          <w:color w:val="215868" w:themeColor="accent5" w:themeShade="80"/>
+          <w:lang w:val="en-US" w:eastAsia="zh-CN"/>
+        </w:rPr>
+        <w:t>合格模式</w:t>
+      </w:r>
+      <w:r>
+        <w:rPr>
+          <w:rFonts w:eastAsiaTheme="minorEastAsia"/>
+          <w:b/>
+          <w:bCs/>
+          <w:color w:val="215868" w:themeColor="accent5" w:themeShade="80"/>
+          <w:lang w:val="en-US" w:eastAsia="zh-CN"/>
+        </w:rPr>
+        <w:t>”</w:t>
+      </w:r>
+      <w:r>
+        <w:rPr>
+          <w:rFonts w:eastAsiaTheme="minorEastAsia"/>
+          <w:b/>
+          <w:bCs/>
+          <w:color w:val="215868" w:themeColor="accent5" w:themeShade="80"/>
+          <w:lang w:val="en-US" w:eastAsia="zh-CN"/>
+        </w:rPr>
+        <w:t>的输入时，解码器将难以准确还原，导致重构误差显著增大。通过设定合理的误差阈值，即可实现对各类语义异常和逻辑错误的敏感识别。</w:t>
+      </w:r>
+    </w:p>
+    <w:p>
+      <w:pPr>
+        <w:suppressAutoHyphens w:val="0"/>
+        <w:spacing w:line="240" w:lineRule="auto"/>
+        <w:ind w:leftChars="0" w:left="0" w:firstLineChars="0" w:firstLine="0"/>
+        <w:textAlignment w:val="auto"/>
+        <w:outlineLvl w:val="9"/>
+        <w:rPr>
+          <w:rFonts w:eastAsiaTheme="minorEastAsia"/>
+          <w:b/>
+          <w:bCs/>
+          <w:color w:val="215868" w:themeColor="accent5" w:themeShade="80"/>
+          <w:lang w:val="en-US" w:eastAsia="zh-CN"/>
+        </w:rPr>
+      </w:pPr>
+      <w:r>
+        <w:rPr>
+          <w:rFonts w:eastAsiaTheme="minorEastAsia"/>
+          <w:b/>
+          <w:bCs/>
+          <w:color w:val="215868" w:themeColor="accent5" w:themeShade="80"/>
+          <w:lang w:val="en-US" w:eastAsia="zh-CN"/>
+        </w:rPr>
+        <w:br w:type="page"/>
+      </w:r>
+    </w:p>
+    <w:p>
+      <w:pPr>
+        <w:spacing w:line="276" w:lineRule="auto"/>
+        <w:ind w:left="0" w:hanging="2"/>
+        <w:rPr>
+          <w:rFonts w:eastAsiaTheme="minorEastAsia" w:hint="eastAsia"/>
+          <w:b/>
+          <w:bCs/>
+          <w:color w:val="215868" w:themeColor="accent5" w:themeShade="80"/>
+          <w:lang w:val="en-US" w:eastAsia="zh-CN"/>
+        </w:rPr>
+      </w:pPr>
+    </w:p>
+    <w:p>
+      <w:pPr>
+        <w:spacing w:line="276" w:lineRule="auto"/>
+        <w:ind w:left="0" w:hanging="2"/>
+        <w:rPr>
+          <w:color w:val="262626"/>
+          <w:lang w:val="en-GB"/>
+        </w:rPr>
+      </w:pPr>
+      <w:r>
+        <w:rPr>
+          <w:color w:val="262626"/>
+          <w:lang w:val="en-GB"/>
+        </w:rPr>
+        <w:t xml:space="preserve">Project Objectives: </w:t>
+      </w:r>
+      <w:r>
+        <w:rPr>
+          <w:color w:val="FF0000"/>
+          <w:lang w:val="en-GB"/>
+        </w:rPr>
+        <w:t>(Describe the objectives of your thesis project, what you aim to achieve.)</w:t>
+      </w:r>
+    </w:p>
+    <w:p>
+      <w:pPr>
+        <w:spacing w:line="276" w:lineRule="auto"/>
+        <w:ind w:left="0" w:hanging="2"/>
+        <w:rPr>
+          <w:rFonts w:eastAsiaTheme="minorEastAsia"/>
+          <w:color w:val="262626"/>
+          <w:lang w:val="en-GB" w:eastAsia="zh-CN"/>
+        </w:rPr>
+      </w:pPr>
+      <w:proofErr w:type="spellStart"/>
+      <w:r>
+        <w:rPr>
+          <w:rFonts w:hint="eastAsia"/>
+          <w:color w:val="262626"/>
+          <w:lang w:val="en-GB" w:eastAsia="zh-CN"/>
+        </w:rPr>
+        <w:t>研究目标</w:t>
+      </w:r>
+      <w:proofErr w:type="spellEnd"/>
+      <w:r>
+        <w:rPr>
+          <w:rFonts w:hint="eastAsia"/>
+          <w:color w:val="262626"/>
+          <w:lang w:val="en-GB" w:eastAsia="zh-CN"/>
+        </w:rPr>
+        <w:t>：（</w:t>
+      </w:r>
+      <w:proofErr w:type="spellStart"/>
+      <w:r>
+        <w:rPr>
+          <w:rFonts w:hint="eastAsia"/>
+          <w:color w:val="262626"/>
+          <w:lang w:val="en-GB" w:eastAsia="zh-CN"/>
+        </w:rPr>
+        <w:t>阐述论文的研究目标，以及拟达成的研究成果</w:t>
+      </w:r>
+      <w:proofErr w:type="spellEnd"/>
+      <w:r>
+        <w:rPr>
+          <w:rFonts w:hint="eastAsia"/>
+          <w:color w:val="262626"/>
+          <w:lang w:val="en-GB" w:eastAsia="zh-CN"/>
+        </w:rPr>
+        <w:t>）</w:t>
+      </w:r>
+    </w:p>
+    <w:p>
+      <w:pPr>
+        <w:spacing w:line="276" w:lineRule="auto"/>
+        <w:ind w:left="0" w:hanging="2"/>
+        <w:rPr>
+          <w:rFonts w:eastAsiaTheme="minorEastAsia"/>
+          <w:color w:val="000000" w:themeColor="text1"/>
+          <w:lang w:val="en-GB" w:eastAsia="zh-CN"/>
+        </w:rPr>
+      </w:pPr>
+      <w:r>
+        <w:rPr>
+          <w:rFonts w:eastAsiaTheme="minorEastAsia" w:hint="eastAsia"/>
+          <w:color w:val="000000" w:themeColor="text1"/>
+          <w:lang w:val="en-GB" w:eastAsia="zh-CN"/>
+        </w:rPr>
+        <w:t>本文研究目标</w:t>
+      </w:r>
+      <w:r>
+        <w:rPr>
+          <w:rFonts w:eastAsiaTheme="minorEastAsia" w:hint="eastAsia"/>
+          <w:color w:val="000000" w:themeColor="text1"/>
+          <w:lang w:val="en-GB" w:eastAsia="zh-CN"/>
+        </w:rPr>
+        <w:t>，由于</w:t>
+      </w:r>
+      <w:proofErr w:type="gramStart"/>
+      <w:r>
+        <w:rPr>
+          <w:rFonts w:eastAsiaTheme="minorEastAsia" w:hint="eastAsia"/>
+          <w:color w:val="000000" w:themeColor="text1"/>
+          <w:lang w:val="en-GB" w:eastAsia="zh-CN"/>
+        </w:rPr>
+        <w:t>医院算力以及</w:t>
+      </w:r>
+      <w:proofErr w:type="gramEnd"/>
+      <w:r>
+        <w:rPr>
+          <w:rFonts w:eastAsiaTheme="minorEastAsia" w:hint="eastAsia"/>
+          <w:color w:val="000000" w:themeColor="text1"/>
+          <w:lang w:val="en-GB" w:eastAsia="zh-CN"/>
+        </w:rPr>
+        <w:t>成本有限，</w:t>
+      </w:r>
+      <w:r>
+        <w:rPr>
+          <w:rFonts w:eastAsiaTheme="minorEastAsia" w:hint="eastAsia"/>
+          <w:color w:val="000000" w:themeColor="text1"/>
+          <w:lang w:val="en-GB" w:eastAsia="zh-CN"/>
+        </w:rPr>
+        <w:t>构建</w:t>
+      </w:r>
+      <w:r>
+        <w:rPr>
+          <w:rFonts w:eastAsiaTheme="minorEastAsia" w:hint="eastAsia"/>
+          <w:color w:val="000000" w:themeColor="text1"/>
+          <w:lang w:val="en-GB" w:eastAsia="zh-CN"/>
+        </w:rPr>
+        <w:t>一套</w:t>
+      </w:r>
+      <w:r>
+        <w:rPr>
+          <w:rFonts w:ascii="宋体" w:eastAsia="宋体" w:hAnsi="宋体" w:cs="宋体" w:hint="eastAsia"/>
+          <w:color w:val="000000" w:themeColor="text1"/>
+          <w:lang w:val="en-GB" w:eastAsia="zh-CN"/>
+        </w:rPr>
+        <w:t>基于</w:t>
+      </w:r>
+      <w:proofErr w:type="gramStart"/>
+      <w:r>
+        <w:rPr>
+          <w:rFonts w:ascii="宋体" w:eastAsia="宋体" w:hAnsi="宋体" w:cs="宋体" w:hint="eastAsia"/>
+          <w:color w:val="000000" w:themeColor="text1"/>
+          <w:lang w:val="en-GB" w:eastAsia="zh-CN"/>
+        </w:rPr>
+        <w:t>预训练自编码</w:t>
+      </w:r>
+      <w:proofErr w:type="gramEnd"/>
+      <w:r>
+        <w:rPr>
+          <w:rFonts w:ascii="宋体" w:eastAsia="宋体" w:hAnsi="宋体" w:cs="宋体" w:hint="eastAsia"/>
+          <w:color w:val="000000" w:themeColor="text1"/>
+          <w:lang w:val="en-GB" w:eastAsia="zh-CN"/>
+        </w:rPr>
+        <w:t>模型的护理文书缺陷自动检测与质控系统</w:t>
+      </w:r>
+      <w:r>
+        <w:rPr>
+          <w:rFonts w:eastAsiaTheme="minorEastAsia" w:hint="eastAsia"/>
+          <w:color w:val="000000" w:themeColor="text1"/>
+          <w:lang w:val="en-GB" w:eastAsia="zh-CN"/>
+        </w:rPr>
+        <w:t>，</w:t>
+      </w:r>
+      <w:r>
+        <w:rPr>
+          <w:rFonts w:eastAsiaTheme="minorEastAsia" w:hint="eastAsia"/>
+          <w:color w:val="000000" w:themeColor="text1"/>
+          <w:lang w:val="en-GB" w:eastAsia="zh-CN"/>
+        </w:rPr>
+        <w:t>实时监控文书中的缺陷</w:t>
+      </w:r>
+      <w:r>
+        <w:rPr>
+          <w:rFonts w:eastAsiaTheme="minorEastAsia" w:hint="eastAsia"/>
+          <w:color w:val="000000" w:themeColor="text1"/>
+          <w:lang w:val="en-GB" w:eastAsia="zh-CN"/>
+        </w:rPr>
+        <w:t>以及预警</w:t>
+      </w:r>
+      <w:r>
+        <w:rPr>
+          <w:rFonts w:eastAsiaTheme="minorEastAsia" w:hint="eastAsia"/>
+          <w:color w:val="000000" w:themeColor="text1"/>
+          <w:lang w:val="en-GB" w:eastAsia="zh-CN"/>
+        </w:rPr>
+        <w:t>。</w:t>
+      </w:r>
+      <w:r>
+        <w:rPr>
+          <w:rFonts w:eastAsiaTheme="minorEastAsia" w:hint="eastAsia"/>
+          <w:color w:val="000000" w:themeColor="text1"/>
+          <w:lang w:val="en-GB" w:eastAsia="zh-CN"/>
+        </w:rPr>
+        <w:t>具体目标包括，（</w:t>
+      </w:r>
+      <w:r>
+        <w:rPr>
+          <w:rFonts w:eastAsiaTheme="minorEastAsia" w:hint="eastAsia"/>
+          <w:color w:val="000000" w:themeColor="text1"/>
+          <w:lang w:val="en-GB" w:eastAsia="zh-CN"/>
+        </w:rPr>
+        <w:t>1</w:t>
+      </w:r>
+      <w:r>
+        <w:rPr>
+          <w:rFonts w:eastAsiaTheme="minorEastAsia" w:hint="eastAsia"/>
+          <w:color w:val="000000" w:themeColor="text1"/>
+          <w:lang w:val="en-GB" w:eastAsia="zh-CN"/>
+        </w:rPr>
+        <w:t>）</w:t>
+      </w:r>
+      <w:r>
+        <w:rPr>
+          <w:rFonts w:eastAsiaTheme="minorEastAsia" w:hint="eastAsia"/>
+          <w:color w:val="000000" w:themeColor="text1"/>
+          <w:lang w:val="en-GB" w:eastAsia="zh-CN"/>
+        </w:rPr>
+        <w:t>构建基于</w:t>
+      </w:r>
+      <w:proofErr w:type="spellStart"/>
+      <w:r>
+        <w:rPr>
+          <w:rFonts w:eastAsiaTheme="minorEastAsia"/>
+          <w:color w:val="000000" w:themeColor="text1"/>
+          <w:lang w:val="en-GB" w:eastAsia="zh-CN"/>
+        </w:rPr>
+        <w:t>bert</w:t>
+      </w:r>
+      <w:proofErr w:type="spellEnd"/>
+      <w:r>
+        <w:rPr>
+          <w:rFonts w:eastAsiaTheme="minorEastAsia"/>
+          <w:color w:val="000000" w:themeColor="text1"/>
+          <w:lang w:val="en-GB" w:eastAsia="zh-CN"/>
+        </w:rPr>
+        <w:t>-base-</w:t>
+      </w:r>
+      <w:proofErr w:type="spellStart"/>
+      <w:r>
+        <w:rPr>
+          <w:rFonts w:eastAsiaTheme="minorEastAsia"/>
+          <w:color w:val="000000" w:themeColor="text1"/>
+          <w:lang w:val="en-GB" w:eastAsia="zh-CN"/>
+        </w:rPr>
+        <w:t>chinese</w:t>
+      </w:r>
+      <w:proofErr w:type="spellEnd"/>
+      <w:r>
+        <w:rPr>
+          <w:rFonts w:eastAsiaTheme="minorEastAsia" w:hint="eastAsia"/>
+          <w:color w:val="000000" w:themeColor="text1"/>
+          <w:lang w:val="en-GB" w:eastAsia="zh-CN"/>
+        </w:rPr>
+        <w:t>微调的护理文书事件抽取模型，实现疼痛药物使用、评估</w:t>
+      </w:r>
+      <w:proofErr w:type="gramStart"/>
+      <w:r>
+        <w:rPr>
+          <w:rFonts w:eastAsiaTheme="minorEastAsia" w:hint="eastAsia"/>
+          <w:color w:val="000000" w:themeColor="text1"/>
+          <w:lang w:val="en-GB" w:eastAsia="zh-CN"/>
+        </w:rPr>
+        <w:t>单创建</w:t>
+      </w:r>
+      <w:proofErr w:type="gramEnd"/>
+      <w:r>
+        <w:rPr>
+          <w:rFonts w:eastAsiaTheme="minorEastAsia" w:hint="eastAsia"/>
+          <w:color w:val="000000" w:themeColor="text1"/>
+          <w:lang w:val="en-GB" w:eastAsia="zh-CN"/>
+        </w:rPr>
+        <w:t>等关键事件的自动识别，并结合时序规则完成质控违规判定；</w:t>
+      </w:r>
+    </w:p>
+    <w:p>
+      <w:pPr>
+        <w:spacing w:line="276" w:lineRule="auto"/>
+        <w:ind w:left="0" w:hanging="2"/>
+        <w:rPr>
+          <w:rFonts w:eastAsiaTheme="minorEastAsia"/>
+          <w:color w:val="000000" w:themeColor="text1"/>
+          <w:lang w:val="en-GB" w:eastAsia="zh-CN"/>
+        </w:rPr>
+      </w:pPr>
+      <w:r>
+        <w:rPr>
+          <w:rFonts w:eastAsiaTheme="minorEastAsia" w:hint="eastAsia"/>
+          <w:color w:val="000000" w:themeColor="text1"/>
+          <w:lang w:val="en-GB" w:eastAsia="zh-CN"/>
+        </w:rPr>
+        <w:t>（</w:t>
+      </w:r>
+      <w:r>
+        <w:rPr>
+          <w:rFonts w:eastAsiaTheme="minorEastAsia"/>
+          <w:color w:val="000000" w:themeColor="text1"/>
+          <w:lang w:val="en-GB" w:eastAsia="zh-CN"/>
+        </w:rPr>
+        <w:t>2</w:t>
+      </w:r>
+      <w:r>
+        <w:rPr>
+          <w:rFonts w:eastAsiaTheme="minorEastAsia" w:hint="eastAsia"/>
+          <w:color w:val="000000" w:themeColor="text1"/>
+          <w:lang w:val="en-GB" w:eastAsia="zh-CN"/>
+        </w:rPr>
+        <w:t>）探索利用无标注护理文书语料进行领域自适应</w:t>
+      </w:r>
+      <w:proofErr w:type="gramStart"/>
+      <w:r>
+        <w:rPr>
+          <w:rFonts w:eastAsiaTheme="minorEastAsia" w:hint="eastAsia"/>
+          <w:color w:val="000000" w:themeColor="text1"/>
+          <w:lang w:val="en-GB" w:eastAsia="zh-CN"/>
+        </w:rPr>
+        <w:t>预训练</w:t>
+      </w:r>
+      <w:proofErr w:type="gramEnd"/>
+      <w:r>
+        <w:rPr>
+          <w:rFonts w:eastAsiaTheme="minorEastAsia" w:hint="eastAsia"/>
+          <w:color w:val="000000" w:themeColor="text1"/>
+          <w:lang w:val="en-GB" w:eastAsia="zh-CN"/>
+        </w:rPr>
+        <w:t>或半监督学习，提升模型对护理场景语义的理解能力，降低对标注数据的依赖。</w:t>
+      </w:r>
+    </w:p>
+    <w:p>
+      <w:pPr>
+        <w:suppressAutoHyphens w:val="0"/>
+        <w:spacing w:line="240" w:lineRule="auto"/>
+        <w:ind w:leftChars="0" w:left="0" w:firstLineChars="0" w:firstLine="0"/>
+        <w:textAlignment w:val="auto"/>
+        <w:outlineLvl w:val="9"/>
+        <w:rPr>
+          <w:rFonts w:eastAsiaTheme="minorEastAsia"/>
+          <w:color w:val="262626"/>
+          <w:lang w:val="en-GB" w:eastAsia="zh-CN"/>
+        </w:rPr>
+      </w:pPr>
+      <w:r>
+        <w:rPr>
+          <w:rFonts w:eastAsiaTheme="minorEastAsia"/>
+          <w:color w:val="262626"/>
+          <w:lang w:val="en-GB" w:eastAsia="zh-CN"/>
+        </w:rPr>
+        <w:br w:type="page"/>
+      </w:r>
+    </w:p>
+    <w:p>
+      <w:pPr>
+        <w:spacing w:line="276" w:lineRule="auto"/>
+        <w:ind w:left="0" w:hanging="2"/>
+        <w:rPr>
+          <w:rFonts w:eastAsiaTheme="minorEastAsia" w:hint="eastAsia"/>
+          <w:color w:val="262626"/>
+          <w:lang w:val="en-GB" w:eastAsia="zh-CN"/>
+        </w:rPr>
+      </w:pPr>
+    </w:p>
+    <w:p>
+      <w:pPr>
+        <w:spacing w:line="276" w:lineRule="auto"/>
+        <w:ind w:left="0" w:hanging="2"/>
+        <w:rPr>
+          <w:color w:val="262626"/>
+          <w:lang w:val="en-GB"/>
+        </w:rPr>
+      </w:pPr>
+      <w:r>
+        <w:rPr>
+          <w:color w:val="262626"/>
+          <w:lang w:val="en-GB"/>
+        </w:rPr>
+        <w:t xml:space="preserve">Research Context: </w:t>
+      </w:r>
+      <w:r>
+        <w:rPr>
+          <w:color w:val="FF0000"/>
+          <w:lang w:val="en-GB"/>
+        </w:rPr>
+        <w:t>(Explain the research context and why it is significant.)</w:t>
+      </w:r>
+    </w:p>
+    <w:p>
+      <w:pPr>
+        <w:spacing w:line="276" w:lineRule="auto"/>
+        <w:ind w:left="0" w:hanging="2"/>
+        <w:rPr>
+          <w:rFonts w:eastAsiaTheme="minorEastAsia"/>
+          <w:color w:val="262626"/>
+          <w:lang w:val="en-GB" w:eastAsia="zh-CN"/>
+        </w:rPr>
+      </w:pPr>
+      <w:proofErr w:type="spellStart"/>
+      <w:r>
+        <w:rPr>
+          <w:rFonts w:hint="eastAsia"/>
+          <w:color w:val="262626"/>
+          <w:lang w:val="en-GB" w:eastAsia="zh-CN"/>
+        </w:rPr>
+        <w:t>研究背景</w:t>
+      </w:r>
+      <w:proofErr w:type="spellEnd"/>
+      <w:r>
+        <w:rPr>
+          <w:rFonts w:hint="eastAsia"/>
+          <w:color w:val="262626"/>
+          <w:lang w:val="en-GB" w:eastAsia="zh-CN"/>
+        </w:rPr>
+        <w:t>：（</w:t>
+      </w:r>
+      <w:proofErr w:type="spellStart"/>
+      <w:r>
+        <w:rPr>
+          <w:rFonts w:hint="eastAsia"/>
+          <w:color w:val="262626"/>
+          <w:lang w:val="en-GB" w:eastAsia="zh-CN"/>
+        </w:rPr>
+        <w:t>说明研究背景，以及该研究的意义</w:t>
+      </w:r>
+      <w:proofErr w:type="spellEnd"/>
+      <w:r>
+        <w:rPr>
+          <w:rFonts w:hint="eastAsia"/>
+          <w:color w:val="262626"/>
+          <w:lang w:val="en-GB" w:eastAsia="zh-CN"/>
+        </w:rPr>
+        <w:t>）</w:t>
+      </w:r>
+    </w:p>
+    <w:p>
+      <w:pPr>
+        <w:suppressAutoHyphens w:val="0"/>
+        <w:spacing w:line="240" w:lineRule="auto"/>
+        <w:ind w:leftChars="0" w:left="0" w:firstLineChars="0" w:firstLine="0"/>
+        <w:textAlignment w:val="auto"/>
+        <w:outlineLvl w:val="9"/>
+        <w:rPr>
+          <w:rFonts w:eastAsiaTheme="minorEastAsia"/>
+          <w:b/>
+          <w:bCs/>
+          <w:color w:val="215868" w:themeColor="accent5" w:themeShade="80"/>
+          <w:lang w:val="en-US" w:eastAsia="zh-CN"/>
+        </w:rPr>
+      </w:pPr>
+      <w:r>
+        <w:rPr>
+          <w:rFonts w:eastAsiaTheme="minorEastAsia"/>
+          <w:b/>
+          <w:bCs/>
+          <w:color w:val="215868" w:themeColor="accent5" w:themeShade="80"/>
+          <w:lang w:val="en-US" w:eastAsia="zh-CN"/>
+        </w:rPr>
+        <w:t>护理文书是医疗记录的重要组成部分，客观记录了患者的病情变化与护理措施，其质量直接影响临床决策与患者安全。国家卫生健康委员会对护理文书书写规范有明确要求，文书</w:t>
+      </w:r>
+      <w:proofErr w:type="gramStart"/>
+      <w:r>
+        <w:rPr>
+          <w:rFonts w:eastAsiaTheme="minorEastAsia"/>
+          <w:b/>
+          <w:bCs/>
+          <w:color w:val="215868" w:themeColor="accent5" w:themeShade="80"/>
+          <w:lang w:val="en-US" w:eastAsia="zh-CN"/>
+        </w:rPr>
+        <w:t>质控是各级</w:t>
+      </w:r>
+      <w:proofErr w:type="gramEnd"/>
+      <w:r>
+        <w:rPr>
+          <w:rFonts w:eastAsiaTheme="minorEastAsia"/>
+          <w:b/>
+          <w:bCs/>
+          <w:color w:val="215868" w:themeColor="accent5" w:themeShade="80"/>
+          <w:lang w:val="en-US" w:eastAsia="zh-CN"/>
+        </w:rPr>
+        <w:t>医疗机构护理管理中的刚性任务。</w:t>
+      </w:r>
+    </w:p>
+    <w:p>
+      <w:pPr>
+        <w:suppressAutoHyphens w:val="0"/>
+        <w:spacing w:line="240" w:lineRule="auto"/>
+        <w:ind w:leftChars="0" w:left="0" w:firstLineChars="0" w:firstLine="0"/>
+        <w:textAlignment w:val="auto"/>
+        <w:outlineLvl w:val="9"/>
+        <w:rPr>
+          <w:rFonts w:eastAsiaTheme="minorEastAsia"/>
+          <w:b/>
+          <w:bCs/>
+          <w:color w:val="215868" w:themeColor="accent5" w:themeShade="80"/>
+          <w:lang w:val="en-US" w:eastAsia="zh-CN"/>
+        </w:rPr>
+      </w:pPr>
+      <w:r>
+        <w:rPr>
+          <w:rFonts w:eastAsiaTheme="minorEastAsia"/>
+          <w:b/>
+          <w:bCs/>
+          <w:color w:val="215868" w:themeColor="accent5" w:themeShade="80"/>
+          <w:lang w:val="en-US" w:eastAsia="zh-CN"/>
+        </w:rPr>
+        <w:t>当前，基层医院的护理文书质</w:t>
+      </w:r>
+      <w:proofErr w:type="gramStart"/>
+      <w:r>
+        <w:rPr>
+          <w:rFonts w:eastAsiaTheme="minorEastAsia"/>
+          <w:b/>
+          <w:bCs/>
+          <w:color w:val="215868" w:themeColor="accent5" w:themeShade="80"/>
+          <w:lang w:val="en-US" w:eastAsia="zh-CN"/>
+        </w:rPr>
+        <w:t>控主要</w:t>
+      </w:r>
+      <w:proofErr w:type="gramEnd"/>
+      <w:r>
+        <w:rPr>
+          <w:rFonts w:eastAsiaTheme="minorEastAsia"/>
+          <w:b/>
+          <w:bCs/>
+          <w:color w:val="215868" w:themeColor="accent5" w:themeShade="80"/>
+          <w:lang w:val="en-US" w:eastAsia="zh-CN"/>
+        </w:rPr>
+        <w:t>依赖人工抽查，存在效率低、覆盖不全、评判标准不统一等问题。部分机构尝试引入规则库或传统分类模型辅助质控，但规则库方法难以应对护理记录中复杂的语义表达，分类模型则受限于特征工程能力，对异常文本的识别效果有限。</w:t>
+      </w:r>
+    </w:p>
+    <w:p>
+      <w:pPr>
+        <w:suppressAutoHyphens w:val="0"/>
+        <w:spacing w:line="240" w:lineRule="auto"/>
+        <w:ind w:leftChars="0" w:left="0" w:firstLineChars="0" w:firstLine="0"/>
+        <w:textAlignment w:val="auto"/>
+        <w:outlineLvl w:val="9"/>
+        <w:rPr>
+          <w:rFonts w:eastAsiaTheme="minorEastAsia"/>
+          <w:b/>
+          <w:bCs/>
+          <w:color w:val="215868" w:themeColor="accent5" w:themeShade="80"/>
+          <w:lang w:val="en-US" w:eastAsia="zh-CN"/>
+        </w:rPr>
+      </w:pPr>
+      <w:r>
+        <w:rPr>
+          <w:rFonts w:eastAsiaTheme="minorEastAsia"/>
+          <w:b/>
+          <w:bCs/>
+          <w:color w:val="215868" w:themeColor="accent5" w:themeShade="80"/>
+          <w:lang w:val="en-US" w:eastAsia="zh-CN"/>
+        </w:rPr>
+        <w:t>近年来，</w:t>
+      </w:r>
+      <w:proofErr w:type="gramStart"/>
+      <w:r>
+        <w:rPr>
+          <w:rFonts w:eastAsiaTheme="minorEastAsia"/>
+          <w:b/>
+          <w:bCs/>
+          <w:color w:val="215868" w:themeColor="accent5" w:themeShade="80"/>
+          <w:lang w:val="en-US" w:eastAsia="zh-CN"/>
+        </w:rPr>
+        <w:t>预训练</w:t>
+      </w:r>
+      <w:proofErr w:type="gramEnd"/>
+      <w:r>
+        <w:rPr>
+          <w:rFonts w:eastAsiaTheme="minorEastAsia"/>
+          <w:b/>
+          <w:bCs/>
+          <w:color w:val="215868" w:themeColor="accent5" w:themeShade="80"/>
+          <w:lang w:val="en-US" w:eastAsia="zh-CN"/>
+        </w:rPr>
+        <w:t>语言模型在医疗文本处理中展现出较强能力。其中，</w:t>
+      </w:r>
+      <w:r>
+        <w:rPr>
+          <w:rFonts w:eastAsiaTheme="minorEastAsia"/>
+          <w:b/>
+          <w:bCs/>
+          <w:color w:val="215868" w:themeColor="accent5" w:themeShade="80"/>
+          <w:lang w:val="en-US" w:eastAsia="zh-CN"/>
+        </w:rPr>
+        <w:t>BERT</w:t>
+      </w:r>
+      <w:r>
+        <w:rPr>
+          <w:rFonts w:eastAsiaTheme="minorEastAsia"/>
+          <w:b/>
+          <w:bCs/>
+          <w:color w:val="215868" w:themeColor="accent5" w:themeShade="80"/>
+          <w:lang w:val="en-US" w:eastAsia="zh-CN"/>
+        </w:rPr>
+        <w:t>类自编码模型参数量较小、推理成本低、部署门槛低，</w:t>
+      </w:r>
+      <w:proofErr w:type="gramStart"/>
+      <w:r>
+        <w:rPr>
+          <w:rFonts w:eastAsiaTheme="minorEastAsia"/>
+          <w:b/>
+          <w:bCs/>
+          <w:color w:val="215868" w:themeColor="accent5" w:themeShade="80"/>
+          <w:lang w:val="en-US" w:eastAsia="zh-CN"/>
+        </w:rPr>
+        <w:t>且预训练</w:t>
+      </w:r>
+      <w:proofErr w:type="gramEnd"/>
+      <w:r>
+        <w:rPr>
+          <w:rFonts w:eastAsiaTheme="minorEastAsia"/>
+          <w:b/>
+          <w:bCs/>
+          <w:color w:val="215868" w:themeColor="accent5" w:themeShade="80"/>
+          <w:lang w:val="en-US" w:eastAsia="zh-CN"/>
+        </w:rPr>
+        <w:t>阶段无需人工标注，更适配基层医院</w:t>
+      </w:r>
+      <w:proofErr w:type="gramStart"/>
+      <w:r>
+        <w:rPr>
+          <w:rFonts w:eastAsiaTheme="minorEastAsia"/>
+          <w:b/>
+          <w:bCs/>
+          <w:color w:val="215868" w:themeColor="accent5" w:themeShade="80"/>
+          <w:lang w:val="en-US" w:eastAsia="zh-CN"/>
+        </w:rPr>
+        <w:t>的算力与</w:t>
+      </w:r>
+      <w:proofErr w:type="gramEnd"/>
+      <w:r>
+        <w:rPr>
+          <w:rFonts w:eastAsiaTheme="minorEastAsia"/>
+          <w:b/>
+          <w:bCs/>
+          <w:color w:val="215868" w:themeColor="accent5" w:themeShade="80"/>
+          <w:lang w:val="en-US" w:eastAsia="zh-CN"/>
+        </w:rPr>
+        <w:t>数据条件，为护理文书质控的智能化提供了新的技术路径。</w:t>
+      </w:r>
+    </w:p>
+    <w:p>
+      <w:pPr>
+        <w:suppressAutoHyphens w:val="0"/>
+        <w:spacing w:line="240" w:lineRule="auto"/>
+        <w:ind w:leftChars="0" w:left="0" w:firstLineChars="0" w:firstLine="0"/>
+        <w:textAlignment w:val="auto"/>
+        <w:outlineLvl w:val="9"/>
+        <w:rPr>
+          <w:rFonts w:eastAsiaTheme="minorEastAsia"/>
+          <w:b/>
+          <w:bCs/>
+          <w:color w:val="215868" w:themeColor="accent5" w:themeShade="80"/>
+          <w:lang w:val="en-US" w:eastAsia="zh-CN"/>
+        </w:rPr>
+      </w:pPr>
+      <w:r>
+        <w:rPr>
+          <w:rFonts w:eastAsiaTheme="minorEastAsia"/>
+          <w:b/>
+          <w:bCs/>
+          <w:color w:val="215868" w:themeColor="accent5" w:themeShade="80"/>
+          <w:lang w:val="en-US" w:eastAsia="zh-CN"/>
+        </w:rPr>
+        <w:t>本研究的意义在于：理论上，探索</w:t>
+      </w:r>
+      <w:proofErr w:type="gramStart"/>
+      <w:r>
+        <w:rPr>
+          <w:rFonts w:eastAsiaTheme="minorEastAsia"/>
+          <w:b/>
+          <w:bCs/>
+          <w:color w:val="215868" w:themeColor="accent5" w:themeShade="80"/>
+          <w:lang w:val="en-US" w:eastAsia="zh-CN"/>
+        </w:rPr>
+        <w:t>预训练自编码</w:t>
+      </w:r>
+      <w:proofErr w:type="gramEnd"/>
+      <w:r>
+        <w:rPr>
+          <w:rFonts w:eastAsiaTheme="minorEastAsia"/>
+          <w:b/>
+          <w:bCs/>
+          <w:color w:val="215868" w:themeColor="accent5" w:themeShade="80"/>
+          <w:lang w:val="en-US" w:eastAsia="zh-CN"/>
+        </w:rPr>
+        <w:t>模型在护理文书质控场景中的适配方法，验证</w:t>
+      </w:r>
+      <w:r>
+        <w:rPr>
+          <w:rFonts w:eastAsiaTheme="minorEastAsia"/>
+          <w:b/>
+          <w:bCs/>
+          <w:color w:val="215868" w:themeColor="accent5" w:themeShade="80"/>
+          <w:lang w:val="en-US" w:eastAsia="zh-CN"/>
+        </w:rPr>
+        <w:t>“</w:t>
+      </w:r>
+      <w:r>
+        <w:rPr>
+          <w:rFonts w:eastAsiaTheme="minorEastAsia"/>
+          <w:b/>
+          <w:bCs/>
+          <w:color w:val="215868" w:themeColor="accent5" w:themeShade="80"/>
+          <w:lang w:val="en-US" w:eastAsia="zh-CN"/>
+        </w:rPr>
+        <w:t>事件抽取</w:t>
+      </w:r>
+      <w:r>
+        <w:rPr>
+          <w:rFonts w:eastAsiaTheme="minorEastAsia"/>
+          <w:b/>
+          <w:bCs/>
+          <w:color w:val="215868" w:themeColor="accent5" w:themeShade="80"/>
+          <w:lang w:val="en-US" w:eastAsia="zh-CN"/>
+        </w:rPr>
+        <w:t>+</w:t>
+      </w:r>
+      <w:r>
+        <w:rPr>
+          <w:rFonts w:eastAsiaTheme="minorEastAsia"/>
+          <w:b/>
+          <w:bCs/>
+          <w:color w:val="215868" w:themeColor="accent5" w:themeShade="80"/>
+          <w:lang w:val="en-US" w:eastAsia="zh-CN"/>
+        </w:rPr>
+        <w:t>时序判断</w:t>
+      </w:r>
+      <w:r>
+        <w:rPr>
+          <w:rFonts w:eastAsiaTheme="minorEastAsia"/>
+          <w:b/>
+          <w:bCs/>
+          <w:color w:val="215868" w:themeColor="accent5" w:themeShade="80"/>
+          <w:lang w:val="en-US" w:eastAsia="zh-CN"/>
+        </w:rPr>
+        <w:t>”</w:t>
+      </w:r>
+      <w:r>
+        <w:rPr>
+          <w:rFonts w:eastAsiaTheme="minorEastAsia"/>
+          <w:b/>
+          <w:bCs/>
+          <w:color w:val="215868" w:themeColor="accent5" w:themeShade="80"/>
+          <w:lang w:val="en-US" w:eastAsia="zh-CN"/>
+        </w:rPr>
+        <w:t>范式在质控任务中的可行性；应用上，为基层医院提供一套低成本、可部署的护理文书质控方案，降低人力成本，提升质控覆盖率与一致性。</w:t>
+      </w:r>
+    </w:p>
+    <w:p>
+      <w:pPr>
+        <w:suppressAutoHyphens w:val="0"/>
+        <w:spacing w:line="240" w:lineRule="auto"/>
+        <w:ind w:leftChars="0" w:left="0" w:firstLineChars="0" w:firstLine="0"/>
+        <w:textAlignment w:val="auto"/>
+        <w:outlineLvl w:val="9"/>
+        <w:rPr>
+          <w:rFonts w:eastAsiaTheme="minorEastAsia"/>
+          <w:color w:val="262626"/>
+          <w:lang w:val="en-GB" w:eastAsia="zh-CN"/>
+        </w:rPr>
+      </w:pPr>
+      <w:r>
+        <w:rPr>
+          <w:rFonts w:eastAsiaTheme="minorEastAsia"/>
+          <w:color w:val="262626"/>
+          <w:lang w:val="en-GB" w:eastAsia="zh-CN"/>
+        </w:rPr>
+        <w:br w:type="page"/>
+      </w:r>
+    </w:p>
+    <w:p>
+      <w:pPr>
+        <w:spacing w:line="276" w:lineRule="auto"/>
+        <w:ind w:left="0" w:hanging="2"/>
+        <w:rPr>
+          <w:rFonts w:eastAsiaTheme="minorEastAsia" w:hint="eastAsia"/>
+          <w:color w:val="262626"/>
+          <w:lang w:val="en-GB" w:eastAsia="zh-CN"/>
+        </w:rPr>
+      </w:pPr>
+    </w:p>
+    <w:p>
+      <w:pPr>
+        <w:spacing w:line="276" w:lineRule="auto"/>
+        <w:ind w:left="0" w:hanging="2"/>
+        <w:rPr>
+          <w:color w:val="FF0000"/>
+          <w:lang w:val="en-GB"/>
+        </w:rPr>
+      </w:pPr>
+      <w:r>
+        <w:rPr>
+          <w:color w:val="262626"/>
+          <w:lang w:val="en-GB"/>
+        </w:rPr>
+        <w:t xml:space="preserve">Methodology: </w:t>
+      </w:r>
+      <w:r>
+        <w:rPr>
+          <w:color w:val="FF0000"/>
+          <w:lang w:val="en-GB"/>
+        </w:rPr>
+        <w:t>(Explain the methodology you will use to conduct your research, e.g., surveys, case studies, statistical analysis, etc.)</w:t>
+      </w:r>
+    </w:p>
+    <w:p>
+      <w:pPr>
+        <w:spacing w:line="276" w:lineRule="auto"/>
+        <w:ind w:left="0" w:hanging="2"/>
+        <w:rPr>
+          <w:rFonts w:eastAsiaTheme="minorEastAsia"/>
+          <w:color w:val="262626"/>
+          <w:lang w:val="en-GB" w:eastAsia="zh-CN"/>
+        </w:rPr>
+      </w:pPr>
+      <w:proofErr w:type="spellStart"/>
+      <w:r>
+        <w:rPr>
+          <w:rFonts w:hint="eastAsia"/>
+          <w:color w:val="262626"/>
+          <w:lang w:val="en-GB" w:eastAsia="zh-CN"/>
+        </w:rPr>
+        <w:t>研究方法</w:t>
+      </w:r>
+      <w:proofErr w:type="spellEnd"/>
+      <w:r>
+        <w:rPr>
+          <w:rFonts w:hint="eastAsia"/>
+          <w:color w:val="262626"/>
+          <w:lang w:val="en-GB" w:eastAsia="zh-CN"/>
+        </w:rPr>
+        <w:t>：（</w:t>
+      </w:r>
+      <w:proofErr w:type="spellStart"/>
+      <w:r>
+        <w:rPr>
+          <w:rFonts w:hint="eastAsia"/>
+          <w:color w:val="262626"/>
+          <w:lang w:val="en-GB" w:eastAsia="zh-CN"/>
+        </w:rPr>
+        <w:t>阐述开展本项研究将采用的方法，如问卷调查、案例分析、统计分析等</w:t>
+      </w:r>
+      <w:proofErr w:type="spellEnd"/>
+      <w:r>
+        <w:rPr>
+          <w:rFonts w:hint="eastAsia"/>
+          <w:color w:val="262626"/>
+          <w:lang w:val="en-GB" w:eastAsia="zh-CN"/>
+        </w:rPr>
+        <w:t>）</w:t>
+      </w:r>
+    </w:p>
+    <w:p>
+      <w:pPr>
+        <w:spacing w:line="276" w:lineRule="auto"/>
+        <w:ind w:left="0" w:hanging="2"/>
+        <w:rPr>
+          <w:rFonts w:eastAsiaTheme="minorEastAsia"/>
+          <w:color w:val="262626"/>
+          <w:lang w:val="en-GB" w:eastAsia="zh-CN"/>
+        </w:rPr>
+      </w:pPr>
+      <w:r>
+        <w:rPr>
+          <w:rFonts w:eastAsiaTheme="minorEastAsia" w:hint="eastAsia"/>
+          <w:color w:val="262626"/>
+          <w:lang w:val="en-GB" w:eastAsia="zh-CN"/>
+        </w:rPr>
+        <w:t>数据构建：</w:t>
+      </w:r>
+    </w:p>
+    <w:p>
+      <w:pPr>
+        <w:spacing w:line="276" w:lineRule="auto"/>
+        <w:ind w:left="0" w:hanging="2"/>
+        <w:rPr>
+          <w:rFonts w:eastAsiaTheme="minorEastAsia"/>
+          <w:color w:val="262626"/>
+          <w:lang w:val="en-GB" w:eastAsia="zh-CN"/>
+        </w:rPr>
+      </w:pPr>
+      <w:r>
+        <w:rPr>
+          <w:rFonts w:eastAsiaTheme="minorEastAsia" w:hint="eastAsia"/>
+          <w:color w:val="262626"/>
+          <w:lang w:val="en-GB" w:eastAsia="zh-CN"/>
+        </w:rPr>
+        <w:t>模型构建：</w:t>
+      </w:r>
+    </w:p>
+    <w:p>
+      <w:pPr>
+        <w:spacing w:line="276" w:lineRule="auto"/>
+        <w:ind w:left="0" w:hanging="2"/>
+        <w:rPr>
+          <w:rFonts w:eastAsiaTheme="minorEastAsia" w:hint="eastAsia"/>
+          <w:color w:val="262626"/>
+          <w:lang w:val="en-GB" w:eastAsia="zh-CN"/>
+        </w:rPr>
+      </w:pPr>
+      <w:r>
+        <w:rPr>
+          <w:rFonts w:eastAsiaTheme="minorEastAsia" w:hint="eastAsia"/>
+          <w:color w:val="262626"/>
+          <w:lang w:val="en-GB" w:eastAsia="zh-CN"/>
+        </w:rPr>
+        <w:t>质控判断：</w:t>
+      </w:r>
+    </w:p>
+    <w:p>
+      <w:pPr>
+        <w:suppressAutoHyphens w:val="0"/>
+        <w:spacing w:line="240" w:lineRule="auto"/>
+        <w:ind w:leftChars="0" w:left="0" w:firstLineChars="0" w:firstLine="0"/>
+        <w:textAlignment w:val="auto"/>
+        <w:outlineLvl w:val="9"/>
+        <w:rPr>
+          <w:color w:val="262626"/>
+          <w:lang w:val="en-GB" w:eastAsia="zh-CN"/>
+        </w:rPr>
+      </w:pPr>
+      <w:r>
+        <w:rPr>
+          <w:color w:val="262626"/>
+          <w:lang w:val="en-GB" w:eastAsia="zh-CN"/>
+        </w:rPr>
+        <w:br w:type="page"/>
+      </w:r>
+    </w:p>
+    <w:p>
+      <w:pPr>
+        <w:spacing w:line="276" w:lineRule="auto"/>
+        <w:ind w:left="0" w:hanging="2"/>
+        <w:rPr>
+          <w:color w:val="262626"/>
+          <w:lang w:val="en-GB" w:eastAsia="zh-CN"/>
+        </w:rPr>
+      </w:pPr>
+    </w:p>
+    <w:p>
+      <w:pPr>
+        <w:spacing w:line="276" w:lineRule="auto"/>
+        <w:ind w:left="0" w:hanging="2"/>
+        <w:rPr>
+          <w:color w:val="262626"/>
+          <w:lang w:val="en-GB"/>
+        </w:rPr>
+      </w:pPr>
+      <w:r>
+        <w:rPr>
+          <w:color w:val="262626"/>
+          <w:lang w:val="en-GB"/>
+        </w:rPr>
+        <w:t xml:space="preserve">Expected Outcomes: </w:t>
+      </w:r>
+      <w:r>
+        <w:rPr>
+          <w:color w:val="FF0000"/>
+          <w:lang w:val="en-GB"/>
+        </w:rPr>
+        <w:t>(Present the expected outcomes you hope to obtain at the end of your research.)</w:t>
+      </w:r>
+    </w:p>
+    <w:p>
+      <w:pPr>
+        <w:spacing w:line="276" w:lineRule="auto"/>
+        <w:ind w:left="0" w:hanging="2"/>
+        <w:rPr>
+          <w:rFonts w:eastAsiaTheme="minorEastAsia"/>
+          <w:color w:val="262626"/>
+          <w:lang w:val="en-GB" w:eastAsia="zh-CN"/>
+        </w:rPr>
+      </w:pPr>
+      <w:proofErr w:type="spellStart"/>
+      <w:r>
+        <w:rPr>
+          <w:rFonts w:hint="eastAsia"/>
+          <w:color w:val="262626"/>
+          <w:lang w:val="en-GB" w:eastAsia="zh-CN"/>
+        </w:rPr>
+        <w:t>预期研究成果</w:t>
+      </w:r>
+      <w:proofErr w:type="spellEnd"/>
+      <w:r>
+        <w:rPr>
+          <w:rFonts w:hint="eastAsia"/>
+          <w:color w:val="262626"/>
+          <w:lang w:val="en-GB" w:eastAsia="zh-CN"/>
+        </w:rPr>
+        <w:t>：（</w:t>
+      </w:r>
+      <w:proofErr w:type="spellStart"/>
+      <w:r>
+        <w:rPr>
+          <w:rFonts w:hint="eastAsia"/>
+          <w:color w:val="262626"/>
+          <w:lang w:val="en-GB" w:eastAsia="zh-CN"/>
+        </w:rPr>
+        <w:t>说明研究结束后拟取得的预期成果</w:t>
+      </w:r>
+      <w:proofErr w:type="spellEnd"/>
+      <w:r>
+        <w:rPr>
+          <w:rFonts w:hint="eastAsia"/>
+          <w:color w:val="262626"/>
+          <w:lang w:val="en-GB" w:eastAsia="zh-CN"/>
+        </w:rPr>
+        <w:t>）</w:t>
+      </w:r>
+    </w:p>
+    <w:p>
+      <w:pPr>
+        <w:spacing w:line="276" w:lineRule="auto"/>
+        <w:ind w:left="0" w:hanging="2"/>
+        <w:rPr>
+          <w:rFonts w:eastAsiaTheme="minorEastAsia" w:hint="eastAsia"/>
+          <w:color w:val="262626"/>
+          <w:lang w:val="en-GB" w:eastAsia="zh-CN"/>
+        </w:rPr>
+      </w:pPr>
+      <w:r>
+        <w:rPr>
+          <w:rFonts w:eastAsiaTheme="minorEastAsia" w:hint="eastAsia"/>
+          <w:color w:val="262626"/>
+          <w:lang w:val="en-GB" w:eastAsia="zh-CN"/>
+        </w:rPr>
+        <w:t>预期成果包括：一套护理文书事件抽取模型、一套事件识别与时序判断相结合的质控流程，以及基于自建测试集的对比实验结果，验证该方法在基层医院场景下的可行性与有效性。</w:t>
+      </w:r>
+    </w:p>
+    <w:p>
+      <w:pPr>
+        <w:suppressAutoHyphens w:val="0"/>
+        <w:spacing w:line="240" w:lineRule="auto"/>
+        <w:ind w:leftChars="0" w:left="0" w:firstLineChars="0" w:firstLine="0"/>
+        <w:textAlignment w:val="auto"/>
+        <w:outlineLvl w:val="9"/>
+        <w:rPr>
+          <w:rFonts w:eastAsiaTheme="minorEastAsia"/>
+          <w:color w:val="FF0000"/>
+          <w:lang w:val="en-GB" w:eastAsia="zh-CN"/>
+        </w:rPr>
+      </w:pPr>
+      <w:r>
+        <w:rPr>
+          <w:rFonts w:eastAsiaTheme="minorEastAsia"/>
+          <w:color w:val="FF0000"/>
+          <w:lang w:val="en-GB" w:eastAsia="zh-CN"/>
+        </w:rPr>
+        <w:br w:type="page"/>
+      </w:r>
+    </w:p>
+    <w:p>
+      <w:pPr>
+        <w:spacing w:line="276" w:lineRule="auto"/>
+        <w:ind w:left="0" w:hanging="2"/>
+        <w:rPr>
+          <w:rFonts w:eastAsiaTheme="minorEastAsia" w:hint="eastAsia"/>
+          <w:color w:val="FF0000"/>
+          <w:lang w:val="en-GB" w:eastAsia="zh-CN"/>
+        </w:rPr>
+      </w:pPr>
+      <w:r>
+        <w:rPr>
+          <w:color w:val="262626"/>
+          <w:lang w:val="en-GB"/>
+        </w:rPr>
+        <w:lastRenderedPageBreak/>
+        <w:t xml:space="preserve">Projected Timeline: </w:t>
+      </w:r>
+      <w:r>
+        <w:rPr>
+          <w:color w:val="FF0000"/>
+          <w:lang w:val="en-GB"/>
+        </w:rPr>
+        <w:t>(Develop a projected timeline for your research, including key milestones and completion dates.)</w:t>
+      </w:r>
+    </w:p>
+    <w:p>
+      <w:pPr>
+        <w:spacing w:line="276" w:lineRule="auto"/>
+        <w:ind w:left="0" w:hanging="2"/>
+        <w:rPr>
+          <w:rFonts w:eastAsiaTheme="minorEastAsia"/>
+          <w:color w:val="262626"/>
+          <w:lang w:val="en-GB" w:eastAsia="zh-CN"/>
+        </w:rPr>
+      </w:pPr>
+      <w:proofErr w:type="spellStart"/>
+      <w:r>
+        <w:rPr>
+          <w:rFonts w:hint="eastAsia"/>
+          <w:color w:val="262626"/>
+          <w:lang w:val="en-GB" w:eastAsia="zh-CN"/>
+        </w:rPr>
+        <w:t>研究时间规划</w:t>
+      </w:r>
+      <w:proofErr w:type="spellEnd"/>
+      <w:r>
+        <w:rPr>
+          <w:rFonts w:hint="eastAsia"/>
+          <w:color w:val="262626"/>
+          <w:lang w:val="en-GB" w:eastAsia="zh-CN"/>
+        </w:rPr>
+        <w:t>：（</w:t>
+      </w:r>
+      <w:proofErr w:type="spellStart"/>
+      <w:r>
+        <w:rPr>
+          <w:rFonts w:hint="eastAsia"/>
+          <w:color w:val="262626"/>
+          <w:lang w:val="en-GB" w:eastAsia="zh-CN"/>
+        </w:rPr>
+        <w:t>制定研究的时间规划，包括关键研究节点及完成时间</w:t>
+      </w:r>
+      <w:proofErr w:type="spellEnd"/>
+      <w:r>
+        <w:rPr>
+          <w:rFonts w:hint="eastAsia"/>
+          <w:color w:val="262626"/>
+          <w:lang w:val="en-GB" w:eastAsia="zh-CN"/>
+        </w:rPr>
+        <w:t>）</w:t>
+      </w:r>
+    </w:p>
+    <w:p>
+      <w:pPr>
+        <w:suppressAutoHyphens w:val="0"/>
+        <w:spacing w:line="240" w:lineRule="auto"/>
+        <w:ind w:leftChars="0" w:left="0" w:firstLineChars="0" w:firstLine="0"/>
+        <w:textAlignment w:val="auto"/>
+        <w:outlineLvl w:val="9"/>
+        <w:rPr>
+          <w:rFonts w:eastAsiaTheme="minorEastAsia"/>
+          <w:color w:val="262626"/>
+          <w:lang w:val="en-GB" w:eastAsia="zh-CN"/>
+        </w:rPr>
+      </w:pPr>
+      <w:r>
+        <w:rPr>
+          <w:rFonts w:eastAsiaTheme="minorEastAsia"/>
+          <w:color w:val="262626"/>
+          <w:lang w:val="en-GB" w:eastAsia="zh-CN"/>
+        </w:rPr>
+        <w:br w:type="page"/>
+      </w:r>
+    </w:p>
+    <w:p>
+      <w:pPr>
+        <w:spacing w:line="276" w:lineRule="auto"/>
+        <w:ind w:left="0" w:hanging="2"/>
+        <w:rPr>
+          <w:rFonts w:eastAsiaTheme="minorEastAsia" w:hint="eastAsia"/>
+          <w:color w:val="262626"/>
+          <w:lang w:val="en-GB" w:eastAsia="zh-CN"/>
+        </w:rPr>
+      </w:pPr>
+    </w:p>
+    <w:p>
+      <w:pPr>
+        <w:spacing w:line="276" w:lineRule="auto"/>
+        <w:ind w:left="0" w:hanging="2"/>
+        <w:rPr>
+          <w:color w:val="FF0000"/>
+          <w:lang w:val="en-GB"/>
+        </w:rPr>
+      </w:pPr>
+      <w:r>
+        <w:rPr>
+          <w:color w:val="262626"/>
+          <w:lang w:val="en-GB"/>
+        </w:rPr>
+        <w:t xml:space="preserve">Preliminary Bibliography: </w:t>
+      </w:r>
+      <w:r>
+        <w:rPr>
+          <w:color w:val="FF0000"/>
+          <w:lang w:val="en-GB"/>
+        </w:rPr>
+        <w:t>(List the primary sources and references you plan to consult for your research.)</w:t>
+      </w:r>
+    </w:p>
+    <w:p>
+      <w:pPr>
+        <w:spacing w:line="276" w:lineRule="auto"/>
+        <w:ind w:leftChars="0" w:left="0" w:firstLineChars="0" w:firstLine="0"/>
+        <w:rPr>
+          <w:rFonts w:eastAsiaTheme="minorEastAsia"/>
+          <w:color w:val="262626"/>
+          <w:lang w:val="en-GB" w:eastAsia="zh-CN"/>
+        </w:rPr>
+      </w:pPr>
+      <w:proofErr w:type="spellStart"/>
+      <w:r>
+        <w:rPr>
+          <w:rFonts w:hint="eastAsia"/>
+          <w:color w:val="262626"/>
+          <w:lang w:val="en-GB" w:eastAsia="zh-CN"/>
+        </w:rPr>
+        <w:t>初步参考文献</w:t>
+      </w:r>
+      <w:proofErr w:type="spellEnd"/>
+      <w:r>
+        <w:rPr>
+          <w:rFonts w:hint="eastAsia"/>
+          <w:color w:val="262626"/>
+          <w:lang w:val="en-GB" w:eastAsia="zh-CN"/>
+        </w:rPr>
+        <w:t>：（</w:t>
+      </w:r>
+      <w:proofErr w:type="spellStart"/>
+      <w:r>
+        <w:rPr>
+          <w:rFonts w:hint="eastAsia"/>
+          <w:color w:val="262626"/>
+          <w:lang w:val="en-GB" w:eastAsia="zh-CN"/>
+        </w:rPr>
+        <w:t>列出本研究拟参考的主要资料和文献</w:t>
+      </w:r>
+      <w:proofErr w:type="spellEnd"/>
+      <w:r>
+        <w:rPr>
+          <w:rFonts w:hint="eastAsia"/>
+          <w:color w:val="262626"/>
+          <w:lang w:val="en-GB" w:eastAsia="zh-CN"/>
+        </w:rPr>
+        <w:t>）</w:t>
+      </w:r>
+    </w:p>
+    <w:p>
+      <w:pPr>
+        <w:spacing w:line="276" w:lineRule="auto"/>
+        <w:ind w:leftChars="0" w:left="0" w:firstLineChars="0" w:firstLine="0"/>
+        <w:rPr>
+          <w:rFonts w:eastAsiaTheme="minorEastAsia"/>
+          <w:color w:val="262626"/>
+          <w:lang w:val="en-GB" w:eastAsia="zh-CN"/>
+        </w:rPr>
+      </w:pPr>
+      <w:r>
+        <w:rPr>
+          <w:rFonts w:eastAsiaTheme="minorEastAsia"/>
+          <w:color w:val="262626"/>
+          <w:lang w:val="en-GB" w:eastAsia="zh-CN"/>
+        </w:rPr>
+        <w:t>[1]</w:t>
+      </w:r>
+      <w:r>
+        <w:rPr>
+          <w:rFonts w:eastAsiaTheme="minorEastAsia" w:hint="eastAsia"/>
+          <w:color w:val="262626"/>
+          <w:lang w:val="en-GB" w:eastAsia="zh-CN"/>
+        </w:rPr>
+        <w:t>张瑜</w:t>
+      </w:r>
+      <w:r>
+        <w:rPr>
+          <w:rFonts w:eastAsiaTheme="minorEastAsia"/>
+          <w:color w:val="262626"/>
+          <w:lang w:val="en-GB" w:eastAsia="zh-CN"/>
+        </w:rPr>
+        <w:t>,</w:t>
+      </w:r>
+      <w:r>
+        <w:rPr>
+          <w:rFonts w:eastAsiaTheme="minorEastAsia" w:hint="eastAsia"/>
+          <w:color w:val="262626"/>
+          <w:lang w:val="en-GB" w:eastAsia="zh-CN"/>
+        </w:rPr>
+        <w:t>吴青松</w:t>
+      </w:r>
+      <w:r>
+        <w:rPr>
+          <w:rFonts w:eastAsiaTheme="minorEastAsia"/>
+          <w:color w:val="262626"/>
+          <w:lang w:val="en-GB" w:eastAsia="zh-CN"/>
+        </w:rPr>
+        <w:t>,</w:t>
+      </w:r>
+      <w:r>
+        <w:rPr>
+          <w:rFonts w:eastAsiaTheme="minorEastAsia" w:hint="eastAsia"/>
+          <w:color w:val="262626"/>
+          <w:lang w:val="en-GB" w:eastAsia="zh-CN"/>
+        </w:rPr>
+        <w:t>胡和</w:t>
+      </w:r>
+      <w:r>
+        <w:rPr>
+          <w:rFonts w:eastAsiaTheme="minorEastAsia"/>
+          <w:color w:val="262626"/>
+          <w:lang w:val="en-GB" w:eastAsia="zh-CN"/>
+        </w:rPr>
+        <w:t>,</w:t>
+      </w:r>
+      <w:r>
+        <w:rPr>
+          <w:rFonts w:eastAsiaTheme="minorEastAsia" w:hint="eastAsia"/>
+          <w:color w:val="262626"/>
+          <w:lang w:val="en-GB" w:eastAsia="zh-CN"/>
+        </w:rPr>
+        <w:t>高志宏</w:t>
+      </w:r>
+      <w:r>
+        <w:rPr>
+          <w:rFonts w:eastAsiaTheme="minorEastAsia"/>
+          <w:color w:val="262626"/>
+          <w:lang w:val="en-GB" w:eastAsia="zh-CN"/>
+        </w:rPr>
+        <w:t>,</w:t>
+      </w:r>
+      <w:r>
+        <w:rPr>
+          <w:rFonts w:eastAsiaTheme="minorEastAsia" w:hint="eastAsia"/>
+          <w:color w:val="262626"/>
+          <w:lang w:val="en-GB" w:eastAsia="zh-CN"/>
+        </w:rPr>
+        <w:t>孙桢</w:t>
+      </w:r>
+      <w:r>
+        <w:rPr>
+          <w:rFonts w:eastAsiaTheme="minorEastAsia"/>
+          <w:color w:val="262626"/>
+          <w:lang w:val="en-GB" w:eastAsia="zh-CN"/>
+        </w:rPr>
+        <w:t xml:space="preserve"> &amp; </w:t>
+      </w:r>
+      <w:proofErr w:type="gramStart"/>
+      <w:r>
+        <w:rPr>
+          <w:rFonts w:eastAsiaTheme="minorEastAsia" w:hint="eastAsia"/>
+          <w:color w:val="262626"/>
+          <w:lang w:val="en-GB" w:eastAsia="zh-CN"/>
+        </w:rPr>
+        <w:t>王华晓</w:t>
+      </w:r>
+      <w:proofErr w:type="gramEnd"/>
+      <w:r>
+        <w:rPr>
+          <w:rFonts w:eastAsiaTheme="minorEastAsia"/>
+          <w:color w:val="262626"/>
+          <w:lang w:val="en-GB" w:eastAsia="zh-CN"/>
+        </w:rPr>
+        <w:t>.(2022).</w:t>
+      </w:r>
+      <w:r>
+        <w:rPr>
+          <w:rFonts w:eastAsiaTheme="minorEastAsia" w:hint="eastAsia"/>
+          <w:color w:val="262626"/>
+          <w:lang w:val="en-GB" w:eastAsia="zh-CN"/>
+        </w:rPr>
+        <w:t>基于人工智能的全程病历质控系统的构建与应用</w:t>
+      </w:r>
+      <w:r>
+        <w:rPr>
+          <w:rFonts w:eastAsiaTheme="minorEastAsia"/>
+          <w:color w:val="262626"/>
+          <w:lang w:val="en-GB" w:eastAsia="zh-CN"/>
+        </w:rPr>
+        <w:t>.</w:t>
+      </w:r>
+      <w:r>
+        <w:rPr>
+          <w:rFonts w:eastAsiaTheme="minorEastAsia" w:hint="eastAsia"/>
+          <w:color w:val="262626"/>
+          <w:lang w:val="en-GB" w:eastAsia="zh-CN"/>
+        </w:rPr>
+        <w:t>中国数字医学</w:t>
+      </w:r>
+      <w:r>
+        <w:rPr>
+          <w:rFonts w:eastAsiaTheme="minorEastAsia"/>
+          <w:color w:val="262626"/>
+          <w:lang w:val="en-GB" w:eastAsia="zh-CN"/>
+        </w:rPr>
+        <w:t>,17 (10),83-87.</w:t>
+      </w:r>
+    </w:p>
+    <w:p>
+      <w:pPr>
+        <w:spacing w:line="276" w:lineRule="auto"/>
+        <w:ind w:leftChars="0" w:left="0" w:firstLineChars="0" w:firstLine="0"/>
+        <w:rPr>
+          <w:rFonts w:eastAsiaTheme="minorEastAsia"/>
+          <w:color w:val="262626"/>
+          <w:lang w:val="en-GB" w:eastAsia="zh-CN"/>
+        </w:rPr>
+      </w:pPr>
+      <w:r>
+        <w:rPr>
+          <w:rFonts w:eastAsiaTheme="minorEastAsia"/>
+          <w:color w:val="262626"/>
+          <w:lang w:val="en-GB" w:eastAsia="zh-CN"/>
+        </w:rPr>
+        <w:t>[</w:t>
+      </w:r>
+      <w:r>
+        <w:rPr>
+          <w:rFonts w:eastAsiaTheme="minorEastAsia" w:hint="eastAsia"/>
+          <w:color w:val="262626"/>
+          <w:lang w:val="en-GB" w:eastAsia="zh-CN"/>
+        </w:rPr>
+        <w:t>2</w:t>
+      </w:r>
+      <w:r>
+        <w:rPr>
+          <w:rFonts w:eastAsiaTheme="minorEastAsia"/>
+          <w:color w:val="262626"/>
+          <w:lang w:val="en-GB" w:eastAsia="zh-CN"/>
+        </w:rPr>
+        <w:t>]</w:t>
+      </w:r>
+      <w:r>
+        <w:rPr>
+          <w:rFonts w:eastAsiaTheme="minorEastAsia" w:hint="eastAsia"/>
+          <w:color w:val="262626"/>
+          <w:lang w:val="en-GB" w:eastAsia="zh-CN"/>
+        </w:rPr>
+        <w:t>王彦华</w:t>
+      </w:r>
+      <w:r>
+        <w:rPr>
+          <w:rFonts w:eastAsiaTheme="minorEastAsia"/>
+          <w:color w:val="262626"/>
+          <w:lang w:val="en-GB" w:eastAsia="zh-CN"/>
+        </w:rPr>
+        <w:t>,</w:t>
+      </w:r>
+      <w:proofErr w:type="gramStart"/>
+      <w:r>
+        <w:rPr>
+          <w:rFonts w:eastAsiaTheme="minorEastAsia" w:hint="eastAsia"/>
+          <w:color w:val="262626"/>
+          <w:lang w:val="en-GB" w:eastAsia="zh-CN"/>
+        </w:rPr>
+        <w:t>房萍</w:t>
+      </w:r>
+      <w:proofErr w:type="gramEnd"/>
+      <w:r>
+        <w:rPr>
+          <w:rFonts w:eastAsiaTheme="minorEastAsia"/>
+          <w:color w:val="262626"/>
+          <w:lang w:val="en-GB" w:eastAsia="zh-CN"/>
+        </w:rPr>
+        <w:t xml:space="preserve"> &amp; </w:t>
+      </w:r>
+      <w:r>
+        <w:rPr>
+          <w:rFonts w:eastAsiaTheme="minorEastAsia" w:hint="eastAsia"/>
+          <w:color w:val="262626"/>
+          <w:lang w:val="en-GB" w:eastAsia="zh-CN"/>
+        </w:rPr>
+        <w:t>周丽</w:t>
+      </w:r>
+      <w:proofErr w:type="gramStart"/>
+      <w:r>
+        <w:rPr>
+          <w:rFonts w:eastAsiaTheme="minorEastAsia" w:hint="eastAsia"/>
+          <w:color w:val="262626"/>
+          <w:lang w:val="en-GB" w:eastAsia="zh-CN"/>
+        </w:rPr>
+        <w:t>丽</w:t>
+      </w:r>
+      <w:proofErr w:type="gramEnd"/>
+      <w:r>
+        <w:rPr>
+          <w:rFonts w:eastAsiaTheme="minorEastAsia"/>
+          <w:color w:val="262626"/>
+          <w:lang w:val="en-GB" w:eastAsia="zh-CN"/>
+        </w:rPr>
+        <w:t>.(2022).PDCA</w:t>
+      </w:r>
+      <w:r>
+        <w:rPr>
+          <w:rFonts w:eastAsiaTheme="minorEastAsia" w:hint="eastAsia"/>
+          <w:color w:val="262626"/>
+          <w:lang w:val="en-GB" w:eastAsia="zh-CN"/>
+        </w:rPr>
+        <w:t>在儿科护理文书书写质量管理的应用</w:t>
+      </w:r>
+      <w:r>
+        <w:rPr>
+          <w:rFonts w:eastAsiaTheme="minorEastAsia"/>
+          <w:color w:val="262626"/>
+          <w:lang w:val="en-GB" w:eastAsia="zh-CN"/>
+        </w:rPr>
+        <w:t>.</w:t>
+      </w:r>
+      <w:r>
+        <w:rPr>
+          <w:rFonts w:eastAsiaTheme="minorEastAsia" w:hint="eastAsia"/>
+          <w:color w:val="262626"/>
+          <w:lang w:val="en-GB" w:eastAsia="zh-CN"/>
+        </w:rPr>
+        <w:t>中国病案</w:t>
+      </w:r>
+      <w:r>
+        <w:rPr>
+          <w:rFonts w:eastAsiaTheme="minorEastAsia"/>
+          <w:color w:val="262626"/>
+          <w:lang w:val="en-GB" w:eastAsia="zh-CN"/>
+        </w:rPr>
+        <w:t>,23 (8),8-10.</w:t>
+      </w:r>
+    </w:p>
+    <w:p>
+      <w:pPr>
+        <w:spacing w:line="276" w:lineRule="auto"/>
+        <w:ind w:leftChars="0" w:left="0" w:firstLineChars="0" w:firstLine="0"/>
+        <w:rPr>
+          <w:rFonts w:eastAsiaTheme="minorEastAsia"/>
+          <w:color w:val="262626"/>
+          <w:lang w:val="en-GB" w:eastAsia="zh-CN"/>
+        </w:rPr>
+      </w:pPr>
+      <w:r>
+        <w:rPr>
+          <w:rFonts w:eastAsiaTheme="minorEastAsia"/>
+          <w:color w:val="262626"/>
+          <w:lang w:val="en-GB" w:eastAsia="zh-CN"/>
+        </w:rPr>
+        <w:t>[</w:t>
+      </w:r>
+      <w:r>
+        <w:rPr>
+          <w:rFonts w:eastAsiaTheme="minorEastAsia" w:hint="eastAsia"/>
+          <w:color w:val="262626"/>
+          <w:lang w:val="en-GB" w:eastAsia="zh-CN"/>
+        </w:rPr>
+        <w:t>3</w:t>
+      </w:r>
+      <w:r>
+        <w:rPr>
+          <w:rFonts w:eastAsiaTheme="minorEastAsia"/>
+          <w:color w:val="262626"/>
+          <w:lang w:val="en-GB" w:eastAsia="zh-CN"/>
+        </w:rPr>
+        <w:t>]</w:t>
+      </w:r>
+      <w:r>
+        <w:rPr>
+          <w:rFonts w:eastAsiaTheme="minorEastAsia" w:hint="eastAsia"/>
+          <w:color w:val="262626"/>
+          <w:lang w:val="en-GB" w:eastAsia="zh-CN"/>
+        </w:rPr>
+        <w:t>曾志</w:t>
+      </w:r>
+      <w:r>
+        <w:rPr>
+          <w:rFonts w:eastAsiaTheme="minorEastAsia"/>
+          <w:color w:val="262626"/>
+          <w:lang w:val="en-GB" w:eastAsia="zh-CN"/>
+        </w:rPr>
+        <w:t>.(2025).</w:t>
+      </w:r>
+      <w:r>
+        <w:rPr>
+          <w:rFonts w:eastAsiaTheme="minorEastAsia" w:hint="eastAsia"/>
+          <w:color w:val="262626"/>
+          <w:lang w:val="en-GB" w:eastAsia="zh-CN"/>
+        </w:rPr>
+        <w:t>基于</w:t>
+      </w:r>
+      <w:r>
+        <w:rPr>
+          <w:rFonts w:eastAsiaTheme="minorEastAsia"/>
+          <w:color w:val="262626"/>
+          <w:lang w:val="en-GB" w:eastAsia="zh-CN"/>
+        </w:rPr>
+        <w:t>NLP</w:t>
+      </w:r>
+      <w:r>
+        <w:rPr>
+          <w:rFonts w:eastAsiaTheme="minorEastAsia" w:hint="eastAsia"/>
+          <w:color w:val="262626"/>
+          <w:lang w:val="en-GB" w:eastAsia="zh-CN"/>
+        </w:rPr>
+        <w:t>技术的大学生英语阅读能力评测与提升策略的设计与应用研究</w:t>
+      </w:r>
+      <w:r>
+        <w:rPr>
+          <w:rFonts w:eastAsiaTheme="minorEastAsia"/>
+          <w:color w:val="262626"/>
+          <w:lang w:val="en-GB" w:eastAsia="zh-CN"/>
+        </w:rPr>
         <w:t>(</w:t>
       </w:r>
-      <w:proofErr w:type="gramEnd"/>
-      <w:r>
-        <w:rPr>
-          <w:rFonts w:eastAsiaTheme="minorEastAsia"/>
-          <w:b/>
-          <w:bCs/>
-          <w:color w:val="215868" w:themeColor="accent5" w:themeShade="80"/>
-          <w:lang w:eastAsia="zh-CN"/>
-        </w:rPr>
-        <w:t>3.33%)</w:t>
-      </w:r>
-      <w:r>
-        <w:rPr>
-          <w:rFonts w:eastAsiaTheme="minorEastAsia"/>
-          <w:b/>
-          <w:bCs/>
-          <w:color w:val="215868" w:themeColor="accent5" w:themeShade="80"/>
-          <w:lang w:eastAsia="zh-CN"/>
-        </w:rPr>
-        <w:t>、护理记录复制</w:t>
-      </w:r>
-      <w:r>
-        <w:rPr>
-          <w:rFonts w:eastAsiaTheme="minorEastAsia"/>
-          <w:b/>
-          <w:bCs/>
-          <w:color w:val="215868" w:themeColor="accent5" w:themeShade="80"/>
-          <w:lang w:eastAsia="zh-CN"/>
-        </w:rPr>
-        <w:t>(3.33%)</w:t>
-      </w:r>
-      <w:r>
-        <w:rPr>
-          <w:rFonts w:eastAsiaTheme="minorEastAsia"/>
-          <w:b/>
-          <w:bCs/>
-          <w:color w:val="215868" w:themeColor="accent5" w:themeShade="80"/>
-          <w:lang w:eastAsia="zh-CN"/>
-        </w:rPr>
-        <w:t>、病情动态评估与描述不准确</w:t>
-      </w:r>
-      <w:r>
-        <w:rPr>
-          <w:rFonts w:eastAsiaTheme="minorEastAsia"/>
-          <w:b/>
-          <w:bCs/>
-          <w:color w:val="215868" w:themeColor="accent5" w:themeShade="80"/>
-          <w:lang w:eastAsia="zh-CN"/>
-        </w:rPr>
-        <w:t>(5.00%)</w:t>
-      </w:r>
-      <w:r>
-        <w:rPr>
-          <w:rFonts w:eastAsiaTheme="minorEastAsia"/>
-          <w:b/>
-          <w:bCs/>
-          <w:color w:val="215868" w:themeColor="accent5" w:themeShade="80"/>
-          <w:lang w:eastAsia="zh-CN"/>
-        </w:rPr>
-        <w:t>、与医师记录不一致</w:t>
-      </w:r>
-      <w:r>
-        <w:rPr>
-          <w:rFonts w:eastAsiaTheme="minorEastAsia"/>
-          <w:b/>
-          <w:bCs/>
-          <w:color w:val="215868" w:themeColor="accent5" w:themeShade="80"/>
-          <w:lang w:eastAsia="zh-CN"/>
-        </w:rPr>
-        <w:t>(3.33%)</w:t>
-      </w:r>
-      <w:r>
-        <w:rPr>
-          <w:rFonts w:eastAsiaTheme="minorEastAsia"/>
-          <w:b/>
-          <w:bCs/>
-          <w:color w:val="215868" w:themeColor="accent5" w:themeShade="80"/>
-          <w:lang w:eastAsia="zh-CN"/>
-        </w:rPr>
-        <w:t>及未体现专科特色</w:t>
-      </w:r>
-      <w:r>
-        <w:rPr>
-          <w:rFonts w:eastAsiaTheme="minorEastAsia"/>
-          <w:b/>
-          <w:bCs/>
-          <w:color w:val="215868" w:themeColor="accent5" w:themeShade="80"/>
-          <w:lang w:eastAsia="zh-CN"/>
-        </w:rPr>
-        <w:t>(3.33%)</w:t>
-      </w:r>
-      <w:r>
-        <w:rPr>
-          <w:rFonts w:eastAsiaTheme="minorEastAsia"/>
-          <w:b/>
-          <w:bCs/>
-          <w:color w:val="215868" w:themeColor="accent5" w:themeShade="80"/>
-          <w:lang w:eastAsia="zh-CN"/>
-        </w:rPr>
-        <w:t>的发生率。</w:t>
-      </w:r>
-      <w:r>
-        <w:rPr>
-          <w:rFonts w:eastAsiaTheme="minorEastAsia" w:hint="eastAsia"/>
-          <w:b/>
-          <w:bCs/>
-          <w:color w:val="215868" w:themeColor="accent5" w:themeShade="80"/>
-          <w:lang w:eastAsia="zh-CN"/>
+      <w:r>
+        <w:rPr>
+          <w:rFonts w:eastAsiaTheme="minorEastAsia" w:hint="eastAsia"/>
+          <w:color w:val="262626"/>
+          <w:lang w:val="en-GB" w:eastAsia="zh-CN"/>
+        </w:rPr>
+        <w:t>硕士学位论文</w:t>
+      </w:r>
+      <w:r>
+        <w:rPr>
+          <w:rFonts w:eastAsiaTheme="minorEastAsia"/>
+          <w:color w:val="262626"/>
+          <w:lang w:val="en-GB" w:eastAsia="zh-CN"/>
+        </w:rPr>
+        <w:t>,</w:t>
+      </w:r>
+      <w:r>
+        <w:rPr>
+          <w:rFonts w:eastAsiaTheme="minorEastAsia" w:hint="eastAsia"/>
+          <w:color w:val="262626"/>
+          <w:lang w:val="en-GB" w:eastAsia="zh-CN"/>
+        </w:rPr>
+        <w:t>浙江师范大学</w:t>
+      </w:r>
+      <w:r>
+        <w:rPr>
+          <w:rFonts w:eastAsiaTheme="minorEastAsia"/>
+          <w:color w:val="262626"/>
+          <w:lang w:val="en-GB" w:eastAsia="zh-CN"/>
+        </w:rPr>
+        <w:t>).</w:t>
+      </w:r>
+      <w:r>
+        <w:rPr>
+          <w:rFonts w:eastAsiaTheme="minorEastAsia" w:hint="eastAsia"/>
+          <w:color w:val="262626"/>
+          <w:lang w:val="en-GB" w:eastAsia="zh-CN"/>
+        </w:rPr>
+        <w:t>硕士</w:t>
+      </w:r>
+      <w:r>
+        <w:rPr>
+          <w:rFonts w:eastAsiaTheme="minorEastAsia"/>
+          <w:color w:val="262626"/>
+          <w:lang w:val="en-GB" w:eastAsia="zh-CN"/>
+        </w:rPr>
+        <w:t xml:space="preserve"> </w:t>
+      </w:r>
+      <w:hyperlink r:id="rId13" w:history="1">
+        <w:r>
+          <w:rPr>
+            <w:rStyle w:val="ac"/>
+            <w:rFonts w:eastAsiaTheme="minorEastAsia"/>
+            <w:lang w:val="en-GB" w:eastAsia="zh-CN"/>
+          </w:rPr>
+          <w:t>https://doi.org/10.27464/d.cnki.gzsfu.2025.000398</w:t>
+        </w:r>
+      </w:hyperlink>
+      <w:r>
+        <w:rPr>
+          <w:rFonts w:eastAsiaTheme="minorEastAsia"/>
+          <w:color w:val="262626"/>
+          <w:lang w:val="en-GB" w:eastAsia="zh-CN"/>
+        </w:rPr>
+        <w:t>.</w:t>
+      </w:r>
+    </w:p>
+    <w:p>
+      <w:pPr>
+        <w:spacing w:line="276" w:lineRule="auto"/>
+        <w:ind w:leftChars="0" w:left="0" w:firstLineChars="0" w:firstLine="0"/>
+        <w:rPr>
+          <w:rFonts w:eastAsiaTheme="minorEastAsia" w:hint="eastAsia"/>
+          <w:color w:val="262626"/>
+          <w:lang w:val="en-GB" w:eastAsia="zh-CN"/>
+        </w:rPr>
+      </w:pPr>
+      <w:r>
+        <w:rPr>
+          <w:rFonts w:eastAsiaTheme="minorEastAsia"/>
+          <w:color w:val="262626"/>
+          <w:lang w:val="en-GB" w:eastAsia="zh-CN"/>
         </w:rPr>
         <w:t>[</w:t>
       </w:r>
       <w:r>
         <w:rPr>
           <w:rFonts w:eastAsiaTheme="minorEastAsia" w:hint="eastAsia"/>
-          <w:b/>
-          <w:bCs/>
-          <w:color w:val="215868" w:themeColor="accent5" w:themeShade="80"/>
-          <w:lang w:eastAsia="zh-CN"/>
-        </w:rPr>
-        <w:t>2</w:t>
-      </w:r>
-      <w:r>
-        <w:rPr>
-          <w:rFonts w:eastAsiaTheme="minorEastAsia" w:hint="eastAsia"/>
-          <w:b/>
-          <w:bCs/>
-          <w:color w:val="215868" w:themeColor="accent5" w:themeShade="80"/>
-          <w:lang w:eastAsia="zh-CN"/>
+          <w:color w:val="262626"/>
+          <w:lang w:val="en-GB" w:eastAsia="zh-CN"/>
+        </w:rPr>
+        <w:t>4</w:t>
+      </w:r>
+      <w:r>
+        <w:rPr>
+          <w:rFonts w:eastAsiaTheme="minorEastAsia"/>
+          <w:color w:val="262626"/>
+          <w:lang w:val="en-GB" w:eastAsia="zh-CN"/>
         </w:rPr>
         <w:t>]</w:t>
       </w:r>
+      <w:r>
+        <w:rPr>
+          <w:rFonts w:eastAsiaTheme="minorEastAsia" w:hint="eastAsia"/>
+          <w:color w:val="262626"/>
+          <w:lang w:val="en-GB" w:eastAsia="zh-CN"/>
+        </w:rPr>
+        <w:t>谢磊鹏</w:t>
+      </w:r>
+      <w:r>
+        <w:rPr>
+          <w:rFonts w:eastAsiaTheme="minorEastAsia"/>
+          <w:color w:val="262626"/>
+          <w:lang w:val="en-GB" w:eastAsia="zh-CN"/>
+        </w:rPr>
+        <w:t>.(2022).</w:t>
+      </w:r>
+      <w:r>
+        <w:rPr>
+          <w:rFonts w:eastAsiaTheme="minorEastAsia" w:hint="eastAsia"/>
+          <w:color w:val="262626"/>
+          <w:lang w:val="en-GB" w:eastAsia="zh-CN"/>
+        </w:rPr>
+        <w:t>基于神经网络的电子病历质控系统设计与实现</w:t>
+      </w:r>
+      <w:r>
+        <w:rPr>
+          <w:rFonts w:eastAsiaTheme="minorEastAsia"/>
+          <w:color w:val="262626"/>
+          <w:lang w:val="en-GB" w:eastAsia="zh-CN"/>
+        </w:rPr>
+        <w:t>(</w:t>
+      </w:r>
+      <w:r>
+        <w:rPr>
+          <w:rFonts w:eastAsiaTheme="minorEastAsia" w:hint="eastAsia"/>
+          <w:color w:val="262626"/>
+          <w:lang w:val="en-GB" w:eastAsia="zh-CN"/>
+        </w:rPr>
+        <w:t>硕士学位论文</w:t>
+      </w:r>
+      <w:r>
+        <w:rPr>
+          <w:rFonts w:eastAsiaTheme="minorEastAsia"/>
+          <w:color w:val="262626"/>
+          <w:lang w:val="en-GB" w:eastAsia="zh-CN"/>
+        </w:rPr>
+        <w:t>,</w:t>
+      </w:r>
+      <w:r>
+        <w:rPr>
+          <w:rFonts w:eastAsiaTheme="minorEastAsia" w:hint="eastAsia"/>
+          <w:color w:val="262626"/>
+          <w:lang w:val="en-GB" w:eastAsia="zh-CN"/>
+        </w:rPr>
+        <w:t>首都经济贸易大学</w:t>
+      </w:r>
+      <w:r>
+        <w:rPr>
+          <w:rFonts w:eastAsiaTheme="minorEastAsia"/>
+          <w:color w:val="262626"/>
+          <w:lang w:val="en-GB" w:eastAsia="zh-CN"/>
+        </w:rPr>
+        <w:t>).</w:t>
+      </w:r>
+      <w:r>
+        <w:rPr>
+          <w:rFonts w:eastAsiaTheme="minorEastAsia" w:hint="eastAsia"/>
+          <w:color w:val="262626"/>
+          <w:lang w:val="en-GB" w:eastAsia="zh-CN"/>
+        </w:rPr>
+        <w:t>硕士</w:t>
+      </w:r>
+      <w:r>
+        <w:rPr>
+          <w:rFonts w:eastAsiaTheme="minorEastAsia"/>
+          <w:color w:val="262626"/>
+          <w:lang w:val="en-GB" w:eastAsia="zh-CN"/>
+        </w:rPr>
+        <w:t xml:space="preserve"> https://doi.org/10.27338/d.cnki.gsjmu.2022.000618.</w:t>
+      </w:r>
     </w:p>
     <w:p>
       <w:pPr>
@@ -1891,14 +4630,14 @@
           <w:color w:val="262626"/>
           <w:lang w:val="en-GB"/>
         </w:rPr>
-        <w:t xml:space="preserve">Project Objectives: </w:t>
+        <w:t xml:space="preserve">Student's Signature: </w:t>
       </w:r>
       <w:r>
         <w:rPr>
           <w:color w:val="FF0000"/>
           <w:lang w:val="en-GB"/>
         </w:rPr>
-        <w:t>(Describe the objectives of your thesis project, what you aim to achieve.)</w:t>
+        <w:t>[Your signature]</w:t>
       </w:r>
     </w:p>
     <w:p>
@@ -1907,7 +4646,7 @@
         <w:ind w:left="0" w:hanging="2"/>
         <w:rPr>
           <w:color w:val="262626"/>
-          <w:lang w:val="en-GB" w:eastAsia="zh-CN"/>
+          <w:lang w:val="en-GB"/>
         </w:rPr>
       </w:pPr>
       <w:proofErr w:type="spellStart"/>
@@ -1915,36 +4654,36 @@
         <w:rPr>
           <w:rFonts w:hint="eastAsia"/>
           <w:color w:val="262626"/>
-          <w:lang w:val="en-GB" w:eastAsia="zh-CN"/>
-        </w:rPr>
-        <w:t>研究目标</w:t>
+          <w:lang w:val="en-GB"/>
+        </w:rPr>
+        <w:t>学生签字</w:t>
       </w:r>
       <w:proofErr w:type="spellEnd"/>
       <w:r>
         <w:rPr>
           <w:rFonts w:hint="eastAsia"/>
           <w:color w:val="262626"/>
-          <w:lang w:val="en-GB" w:eastAsia="zh-CN"/>
-        </w:rPr>
-        <w:t>：（</w:t>
+          <w:lang w:val="en-GB"/>
+        </w:rPr>
+        <w:t>：【</w:t>
       </w:r>
       <w:proofErr w:type="spellStart"/>
       <w:r>
         <w:rPr>
           <w:rFonts w:hint="eastAsia"/>
           <w:color w:val="262626"/>
-          <w:lang w:val="en-GB" w:eastAsia="zh-CN"/>
-        </w:rPr>
-        <w:t>阐述论文的研究目标，以及拟达成的研究成果</w:t>
+          <w:lang w:val="en-GB"/>
+        </w:rPr>
+        <w:t>你的签字</w:t>
       </w:r>
       <w:proofErr w:type="spellEnd"/>
       <w:r>
         <w:rPr>
           <w:rFonts w:hint="eastAsia"/>
           <w:color w:val="262626"/>
-          <w:lang w:val="en-GB" w:eastAsia="zh-CN"/>
-        </w:rPr>
-        <w:t>）</w:t>
+          <w:lang w:val="en-GB"/>
+        </w:rPr>
+        <w:t>】</w:t>
       </w:r>
     </w:p>
     <w:p>
@@ -1961,14 +4700,20 @@
           <w:color w:val="262626"/>
           <w:lang w:val="en-GB"/>
         </w:rPr>
-        <w:t xml:space="preserve">Research Context: </w:t>
+        <w:t>Approved by</w:t>
+      </w:r>
+      <w:r>
+        <w:rPr>
+          <w:lang w:val="en-GB"/>
+        </w:rPr>
+        <w:t>:</w:t>
       </w:r>
       <w:r>
         <w:rPr>
           <w:color w:val="FF0000"/>
           <w:lang w:val="en-GB"/>
         </w:rPr>
-        <w:t>(Explain the research context and why it is significant.)</w:t>
+        <w:t xml:space="preserve"> [The Thesis committee]</w:t>
       </w:r>
     </w:p>
     <w:p>
@@ -1977,7 +4722,7 @@
         <w:ind w:left="0" w:hanging="2"/>
         <w:rPr>
           <w:color w:val="262626"/>
-          <w:lang w:val="en-GB" w:eastAsia="zh-CN"/>
+          <w:lang w:val="en-GB"/>
         </w:rPr>
       </w:pPr>
       <w:proofErr w:type="spellStart"/>
@@ -1985,36 +4730,36 @@
         <w:rPr>
           <w:rFonts w:hint="eastAsia"/>
           <w:color w:val="262626"/>
-          <w:lang w:val="en-GB" w:eastAsia="zh-CN"/>
-        </w:rPr>
-        <w:t>研究背景</w:t>
+          <w:lang w:val="en-GB"/>
+        </w:rPr>
+        <w:t>审核通过</w:t>
       </w:r>
       <w:proofErr w:type="spellEnd"/>
       <w:r>
         <w:rPr>
           <w:rFonts w:hint="eastAsia"/>
           <w:color w:val="262626"/>
-          <w:lang w:val="en-GB" w:eastAsia="zh-CN"/>
-        </w:rPr>
-        <w:t>：（</w:t>
+          <w:lang w:val="en-GB"/>
+        </w:rPr>
+        <w:t>：【</w:t>
       </w:r>
       <w:proofErr w:type="spellStart"/>
       <w:r>
         <w:rPr>
           <w:rFonts w:hint="eastAsia"/>
           <w:color w:val="262626"/>
-          <w:lang w:val="en-GB" w:eastAsia="zh-CN"/>
-        </w:rPr>
-        <w:t>说明研究背景，以及该研究的意义</w:t>
+          <w:lang w:val="en-GB"/>
+        </w:rPr>
+        <w:t>论文委员会</w:t>
       </w:r>
       <w:proofErr w:type="spellEnd"/>
       <w:r>
         <w:rPr>
           <w:rFonts w:hint="eastAsia"/>
           <w:color w:val="262626"/>
-          <w:lang w:val="en-GB" w:eastAsia="zh-CN"/>
-        </w:rPr>
-        <w:t>）</w:t>
+          <w:lang w:val="en-GB"/>
+        </w:rPr>
+        <w:t>】</w:t>
       </w:r>
     </w:p>
     <w:p>
@@ -2022,24 +4767,10 @@
         <w:spacing w:line="276" w:lineRule="auto"/>
         <w:ind w:left="0" w:hanging="2"/>
         <w:rPr>
-          <w:color w:val="FF0000"/>
-          <w:lang w:val="en-GB"/>
-        </w:rPr>
-      </w:pPr>
-      <w:r>
-        <w:rPr>
-          <w:color w:val="262626"/>
-          <w:lang w:val="en-GB"/>
-        </w:rPr>
-        <w:t xml:space="preserve">Methodology: </w:t>
-      </w:r>
-      <w:r>
-        <w:rPr>
-          <w:color w:val="FF0000"/>
-          <w:lang w:val="en-GB"/>
-        </w:rPr>
-        <w:t>(Explain the methodology you will use to conduct your research, e.g., surveys, case studies, statistical analysis, etc.)</w:t>
-      </w:r>
+          <w:color w:val="262626"/>
+          <w:lang w:val="en-GB"/>
+        </w:rPr>
+      </w:pPr>
     </w:p>
     <w:p>
       <w:pPr>
@@ -2047,718 +4778,17 @@
         <w:ind w:left="0" w:hanging="2"/>
         <w:rPr>
           <w:color w:val="262626"/>
-          <w:lang w:val="en-GB" w:eastAsia="zh-CN"/>
-        </w:rPr>
-      </w:pPr>
-      <w:proofErr w:type="spellStart"/>
-      <w:r>
-        <w:rPr>
-          <w:rFonts w:hint="eastAsia"/>
-          <w:color w:val="262626"/>
-          <w:lang w:val="en-GB" w:eastAsia="zh-CN"/>
-        </w:rPr>
-        <w:t>研究方法</w:t>
-      </w:r>
-      <w:proofErr w:type="spellEnd"/>
-      <w:r>
-        <w:rPr>
-          <w:rFonts w:hint="eastAsia"/>
-          <w:color w:val="262626"/>
-          <w:lang w:val="en-GB" w:eastAsia="zh-CN"/>
-        </w:rPr>
-        <w:t>：（</w:t>
-      </w:r>
-      <w:proofErr w:type="spellStart"/>
-      <w:r>
-        <w:rPr>
-          <w:rFonts w:hint="eastAsia"/>
-          <w:color w:val="262626"/>
-          <w:lang w:val="en-GB" w:eastAsia="zh-CN"/>
-        </w:rPr>
-        <w:t>阐述开展本项研究将采用的方法，如问卷调查、案例分析、统计分析等</w:t>
-      </w:r>
-      <w:proofErr w:type="spellEnd"/>
-      <w:r>
-        <w:rPr>
-          <w:rFonts w:hint="eastAsia"/>
-          <w:color w:val="262626"/>
-          <w:lang w:val="en-GB" w:eastAsia="zh-CN"/>
-        </w:rPr>
-        <w:t>）</w:t>
-      </w:r>
-    </w:p>
-    <w:p>
-      <w:pPr>
-        <w:spacing w:line="276" w:lineRule="auto"/>
-        <w:ind w:left="0" w:hanging="2"/>
-        <w:rPr>
-          <w:color w:val="262626"/>
-          <w:lang w:val="en-GB"/>
-        </w:rPr>
-      </w:pPr>
-      <w:r>
-        <w:rPr>
-          <w:color w:val="262626"/>
-          <w:lang w:val="en-GB"/>
-        </w:rPr>
-        <w:t xml:space="preserve">Expected Outcomes: </w:t>
-      </w:r>
-      <w:r>
-        <w:rPr>
-          <w:color w:val="FF0000"/>
-          <w:lang w:val="en-GB"/>
-        </w:rPr>
-        <w:t>(Present the expected outcomes you hope to obtain at the end of your research.)</w:t>
-      </w:r>
-    </w:p>
-    <w:p>
-      <w:pPr>
-        <w:spacing w:line="276" w:lineRule="auto"/>
-        <w:ind w:left="0" w:hanging="2"/>
-        <w:rPr>
-          <w:color w:val="262626"/>
-          <w:lang w:val="en-GB" w:eastAsia="zh-CN"/>
-        </w:rPr>
-      </w:pPr>
-      <w:proofErr w:type="spellStart"/>
-      <w:r>
-        <w:rPr>
-          <w:rFonts w:hint="eastAsia"/>
-          <w:color w:val="262626"/>
-          <w:lang w:val="en-GB" w:eastAsia="zh-CN"/>
-        </w:rPr>
-        <w:t>预期研究成果</w:t>
-      </w:r>
-      <w:proofErr w:type="spellEnd"/>
-      <w:r>
-        <w:rPr>
-          <w:rFonts w:hint="eastAsia"/>
-          <w:color w:val="262626"/>
-          <w:lang w:val="en-GB" w:eastAsia="zh-CN"/>
-        </w:rPr>
-        <w:t>：（</w:t>
-      </w:r>
-      <w:proofErr w:type="spellStart"/>
-      <w:r>
-        <w:rPr>
-          <w:rFonts w:hint="eastAsia"/>
-          <w:color w:val="262626"/>
-          <w:lang w:val="en-GB" w:eastAsia="zh-CN"/>
-        </w:rPr>
-        <w:t>说明研究结束后拟取得的预期成果</w:t>
-      </w:r>
-      <w:proofErr w:type="spellEnd"/>
-      <w:r>
-        <w:rPr>
-          <w:rFonts w:hint="eastAsia"/>
-          <w:color w:val="262626"/>
-          <w:lang w:val="en-GB" w:eastAsia="zh-CN"/>
-        </w:rPr>
-        <w:t>）</w:t>
-      </w:r>
-    </w:p>
-    <w:p>
-      <w:pPr>
-        <w:spacing w:line="276" w:lineRule="auto"/>
-        <w:ind w:left="0" w:hanging="2"/>
-        <w:rPr>
-          <w:color w:val="FF0000"/>
-          <w:lang w:val="en-GB"/>
-        </w:rPr>
-      </w:pPr>
-      <w:r>
-        <w:rPr>
-          <w:color w:val="262626"/>
-          <w:lang w:val="en-GB"/>
-        </w:rPr>
-        <w:t xml:space="preserve">Projected Timeline: </w:t>
-      </w:r>
-      <w:r>
-        <w:rPr>
-          <w:color w:val="FF0000"/>
-          <w:lang w:val="en-GB"/>
-        </w:rPr>
-        <w:t>(Develop a projected timeline for your research, including key milestones and completion dates.)</w:t>
-      </w:r>
-    </w:p>
-    <w:p>
-      <w:pPr>
-        <w:spacing w:line="276" w:lineRule="auto"/>
-        <w:ind w:left="0" w:hanging="2"/>
-        <w:rPr>
-          <w:color w:val="262626"/>
-          <w:lang w:val="en-GB" w:eastAsia="zh-CN"/>
-        </w:rPr>
-      </w:pPr>
-      <w:proofErr w:type="spellStart"/>
-      <w:r>
-        <w:rPr>
-          <w:rFonts w:hint="eastAsia"/>
-          <w:color w:val="262626"/>
-          <w:lang w:val="en-GB" w:eastAsia="zh-CN"/>
-        </w:rPr>
-        <w:t>研究时间规划</w:t>
-      </w:r>
-      <w:proofErr w:type="spellEnd"/>
-      <w:r>
-        <w:rPr>
-          <w:rFonts w:hint="eastAsia"/>
-          <w:color w:val="262626"/>
-          <w:lang w:val="en-GB" w:eastAsia="zh-CN"/>
-        </w:rPr>
-        <w:t>：（</w:t>
-      </w:r>
-      <w:proofErr w:type="spellStart"/>
-      <w:r>
-        <w:rPr>
-          <w:rFonts w:hint="eastAsia"/>
-          <w:color w:val="262626"/>
-          <w:lang w:val="en-GB" w:eastAsia="zh-CN"/>
-        </w:rPr>
-        <w:t>制定研究的时间规划，包括关键研究节点及完成时间</w:t>
-      </w:r>
-      <w:proofErr w:type="spellEnd"/>
-      <w:r>
-        <w:rPr>
-          <w:rFonts w:hint="eastAsia"/>
-          <w:color w:val="262626"/>
-          <w:lang w:val="en-GB" w:eastAsia="zh-CN"/>
-        </w:rPr>
-        <w:t>）</w:t>
-      </w:r>
-    </w:p>
-    <w:p>
-      <w:pPr>
-        <w:spacing w:line="276" w:lineRule="auto"/>
-        <w:ind w:left="0" w:hanging="2"/>
-        <w:rPr>
-          <w:color w:val="FF0000"/>
-          <w:lang w:val="en-GB"/>
-        </w:rPr>
-      </w:pPr>
-      <w:r>
-        <w:rPr>
-          <w:color w:val="262626"/>
-          <w:lang w:val="en-GB"/>
-        </w:rPr>
-        <w:t xml:space="preserve">Preliminary Bibliography: </w:t>
-      </w:r>
-      <w:r>
-        <w:rPr>
-          <w:color w:val="FF0000"/>
-          <w:lang w:val="en-GB"/>
-        </w:rPr>
-        <w:t>(List the primary sources and references you plan to consult for your research.)</w:t>
-      </w:r>
-    </w:p>
-    <w:p>
-      <w:pPr>
-        <w:spacing w:line="276" w:lineRule="auto"/>
-        <w:ind w:leftChars="0" w:left="0" w:firstLineChars="0" w:firstLine="0"/>
-        <w:rPr>
-          <w:rFonts w:eastAsiaTheme="minorEastAsia"/>
-          <w:color w:val="262626"/>
-          <w:lang w:val="en-GB" w:eastAsia="zh-CN"/>
-        </w:rPr>
-      </w:pPr>
-      <w:proofErr w:type="spellStart"/>
-      <w:r>
-        <w:rPr>
-          <w:rFonts w:hint="eastAsia"/>
-          <w:color w:val="262626"/>
-          <w:lang w:val="en-GB" w:eastAsia="zh-CN"/>
-        </w:rPr>
-        <w:t>初步参考文献</w:t>
-      </w:r>
-      <w:proofErr w:type="spellEnd"/>
-      <w:r>
-        <w:rPr>
-          <w:rFonts w:hint="eastAsia"/>
-          <w:color w:val="262626"/>
-          <w:lang w:val="en-GB" w:eastAsia="zh-CN"/>
-        </w:rPr>
-        <w:t>：（</w:t>
-      </w:r>
-      <w:proofErr w:type="spellStart"/>
-      <w:r>
-        <w:rPr>
-          <w:rFonts w:hint="eastAsia"/>
-          <w:color w:val="262626"/>
-          <w:lang w:val="en-GB" w:eastAsia="zh-CN"/>
-        </w:rPr>
-        <w:t>列出本研究拟参考的主要资料和文献</w:t>
-      </w:r>
-      <w:proofErr w:type="spellEnd"/>
-      <w:r>
-        <w:rPr>
-          <w:rFonts w:hint="eastAsia"/>
-          <w:color w:val="262626"/>
-          <w:lang w:val="en-GB" w:eastAsia="zh-CN"/>
-        </w:rPr>
-        <w:t>）</w:t>
-      </w:r>
-    </w:p>
-    <w:p>
-      <w:pPr>
-        <w:spacing w:line="276" w:lineRule="auto"/>
-        <w:ind w:leftChars="0" w:left="0" w:firstLineChars="0" w:firstLine="0"/>
-        <w:rPr>
-          <w:rFonts w:eastAsiaTheme="minorEastAsia"/>
-          <w:color w:val="262626"/>
-          <w:lang w:val="en-GB" w:eastAsia="zh-CN"/>
-        </w:rPr>
-      </w:pPr>
-      <w:r>
-        <w:rPr>
-          <w:rFonts w:eastAsiaTheme="minorEastAsia"/>
-          <w:color w:val="262626"/>
-          <w:lang w:val="en-GB" w:eastAsia="zh-CN"/>
-        </w:rPr>
-        <w:t>[1]</w:t>
-      </w:r>
-      <w:r>
-        <w:rPr>
-          <w:rFonts w:eastAsiaTheme="minorEastAsia" w:hint="eastAsia"/>
-          <w:color w:val="262626"/>
-          <w:lang w:val="en-GB" w:eastAsia="zh-CN"/>
-        </w:rPr>
-        <w:t>张瑜</w:t>
-      </w:r>
-      <w:r>
-        <w:rPr>
-          <w:rFonts w:eastAsiaTheme="minorEastAsia"/>
-          <w:color w:val="262626"/>
-          <w:lang w:val="en-GB" w:eastAsia="zh-CN"/>
-        </w:rPr>
-        <w:t>,</w:t>
-      </w:r>
-      <w:r>
-        <w:rPr>
-          <w:rFonts w:eastAsiaTheme="minorEastAsia" w:hint="eastAsia"/>
-          <w:color w:val="262626"/>
-          <w:lang w:val="en-GB" w:eastAsia="zh-CN"/>
-        </w:rPr>
-        <w:t>吴青松</w:t>
-      </w:r>
-      <w:r>
-        <w:rPr>
-          <w:rFonts w:eastAsiaTheme="minorEastAsia"/>
-          <w:color w:val="262626"/>
-          <w:lang w:val="en-GB" w:eastAsia="zh-CN"/>
-        </w:rPr>
-        <w:t>,</w:t>
-      </w:r>
-      <w:r>
-        <w:rPr>
-          <w:rFonts w:eastAsiaTheme="minorEastAsia" w:hint="eastAsia"/>
-          <w:color w:val="262626"/>
-          <w:lang w:val="en-GB" w:eastAsia="zh-CN"/>
-        </w:rPr>
-        <w:t>胡和</w:t>
-      </w:r>
-      <w:r>
-        <w:rPr>
-          <w:rFonts w:eastAsiaTheme="minorEastAsia"/>
-          <w:color w:val="262626"/>
-          <w:lang w:val="en-GB" w:eastAsia="zh-CN"/>
-        </w:rPr>
-        <w:t>,</w:t>
-      </w:r>
-      <w:r>
-        <w:rPr>
-          <w:rFonts w:eastAsiaTheme="minorEastAsia" w:hint="eastAsia"/>
-          <w:color w:val="262626"/>
-          <w:lang w:val="en-GB" w:eastAsia="zh-CN"/>
-        </w:rPr>
-        <w:t>高志宏</w:t>
-      </w:r>
-      <w:r>
-        <w:rPr>
-          <w:rFonts w:eastAsiaTheme="minorEastAsia"/>
-          <w:color w:val="262626"/>
-          <w:lang w:val="en-GB" w:eastAsia="zh-CN"/>
-        </w:rPr>
-        <w:t>,</w:t>
-      </w:r>
-      <w:r>
-        <w:rPr>
-          <w:rFonts w:eastAsiaTheme="minorEastAsia" w:hint="eastAsia"/>
-          <w:color w:val="262626"/>
-          <w:lang w:val="en-GB" w:eastAsia="zh-CN"/>
-        </w:rPr>
-        <w:t>孙桢</w:t>
-      </w:r>
-      <w:r>
-        <w:rPr>
-          <w:rFonts w:eastAsiaTheme="minorEastAsia"/>
-          <w:color w:val="262626"/>
-          <w:lang w:val="en-GB" w:eastAsia="zh-CN"/>
-        </w:rPr>
-        <w:t xml:space="preserve"> &amp; </w:t>
-      </w:r>
-      <w:proofErr w:type="gramStart"/>
-      <w:r>
-        <w:rPr>
-          <w:rFonts w:eastAsiaTheme="minorEastAsia" w:hint="eastAsia"/>
-          <w:color w:val="262626"/>
-          <w:lang w:val="en-GB" w:eastAsia="zh-CN"/>
-        </w:rPr>
-        <w:t>王华晓</w:t>
-      </w:r>
-      <w:proofErr w:type="gramEnd"/>
-      <w:r>
-        <w:rPr>
-          <w:rFonts w:eastAsiaTheme="minorEastAsia"/>
-          <w:color w:val="262626"/>
-          <w:lang w:val="en-GB" w:eastAsia="zh-CN"/>
-        </w:rPr>
-        <w:t>.(2022).</w:t>
-      </w:r>
-      <w:r>
-        <w:rPr>
-          <w:rFonts w:eastAsiaTheme="minorEastAsia" w:hint="eastAsia"/>
-          <w:color w:val="262626"/>
-          <w:lang w:val="en-GB" w:eastAsia="zh-CN"/>
-        </w:rPr>
-        <w:t>基于人工智能的全程病历质控系统的构建与应用</w:t>
-      </w:r>
-      <w:r>
-        <w:rPr>
-          <w:rFonts w:eastAsiaTheme="minorEastAsia"/>
-          <w:color w:val="262626"/>
-          <w:lang w:val="en-GB" w:eastAsia="zh-CN"/>
-        </w:rPr>
-        <w:t>.</w:t>
-      </w:r>
-      <w:r>
-        <w:rPr>
-          <w:rFonts w:eastAsiaTheme="minorEastAsia" w:hint="eastAsia"/>
-          <w:color w:val="262626"/>
-          <w:lang w:val="en-GB" w:eastAsia="zh-CN"/>
-        </w:rPr>
-        <w:t>中国数字医学</w:t>
-      </w:r>
-      <w:r>
-        <w:rPr>
-          <w:rFonts w:eastAsiaTheme="minorEastAsia"/>
-          <w:color w:val="262626"/>
-          <w:lang w:val="en-GB" w:eastAsia="zh-CN"/>
-        </w:rPr>
-        <w:t>,17 (10),83-87.</w:t>
-      </w:r>
-    </w:p>
-    <w:p>
-      <w:pPr>
-        <w:spacing w:line="276" w:lineRule="auto"/>
-        <w:ind w:leftChars="0" w:left="0" w:firstLineChars="0" w:firstLine="0"/>
-        <w:rPr>
-          <w:rFonts w:eastAsiaTheme="minorEastAsia"/>
-          <w:color w:val="262626"/>
-          <w:lang w:val="en-GB" w:eastAsia="zh-CN"/>
-        </w:rPr>
-      </w:pPr>
-      <w:r>
-        <w:rPr>
-          <w:rFonts w:eastAsiaTheme="minorEastAsia"/>
-          <w:color w:val="262626"/>
-          <w:lang w:val="en-GB" w:eastAsia="zh-CN"/>
-        </w:rPr>
-        <w:t>[</w:t>
-      </w:r>
-      <w:r>
-        <w:rPr>
-          <w:rFonts w:eastAsiaTheme="minorEastAsia" w:hint="eastAsia"/>
-          <w:color w:val="262626"/>
-          <w:lang w:val="en-GB" w:eastAsia="zh-CN"/>
-        </w:rPr>
-        <w:t>2</w:t>
-      </w:r>
-      <w:r>
-        <w:rPr>
-          <w:rFonts w:eastAsiaTheme="minorEastAsia"/>
-          <w:color w:val="262626"/>
-          <w:lang w:val="en-GB" w:eastAsia="zh-CN"/>
-        </w:rPr>
-        <w:t>]</w:t>
-      </w:r>
-      <w:r>
-        <w:rPr>
-          <w:rFonts w:eastAsiaTheme="minorEastAsia" w:hint="eastAsia"/>
-          <w:color w:val="262626"/>
-          <w:lang w:val="en-GB" w:eastAsia="zh-CN"/>
-        </w:rPr>
-        <w:t>王彦华</w:t>
-      </w:r>
-      <w:r>
-        <w:rPr>
-          <w:rFonts w:eastAsiaTheme="minorEastAsia"/>
-          <w:color w:val="262626"/>
-          <w:lang w:val="en-GB" w:eastAsia="zh-CN"/>
-        </w:rPr>
-        <w:t>,</w:t>
-      </w:r>
-      <w:proofErr w:type="gramStart"/>
-      <w:r>
-        <w:rPr>
-          <w:rFonts w:eastAsiaTheme="minorEastAsia" w:hint="eastAsia"/>
-          <w:color w:val="262626"/>
-          <w:lang w:val="en-GB" w:eastAsia="zh-CN"/>
-        </w:rPr>
-        <w:t>房萍</w:t>
-      </w:r>
-      <w:proofErr w:type="gramEnd"/>
-      <w:r>
-        <w:rPr>
-          <w:rFonts w:eastAsiaTheme="minorEastAsia"/>
-          <w:color w:val="262626"/>
-          <w:lang w:val="en-GB" w:eastAsia="zh-CN"/>
-        </w:rPr>
-        <w:t xml:space="preserve"> &amp; </w:t>
-      </w:r>
-      <w:r>
-        <w:rPr>
-          <w:rFonts w:eastAsiaTheme="minorEastAsia" w:hint="eastAsia"/>
-          <w:color w:val="262626"/>
-          <w:lang w:val="en-GB" w:eastAsia="zh-CN"/>
-        </w:rPr>
-        <w:t>周丽</w:t>
-      </w:r>
-      <w:proofErr w:type="gramStart"/>
-      <w:r>
-        <w:rPr>
-          <w:rFonts w:eastAsiaTheme="minorEastAsia" w:hint="eastAsia"/>
-          <w:color w:val="262626"/>
-          <w:lang w:val="en-GB" w:eastAsia="zh-CN"/>
-        </w:rPr>
-        <w:t>丽</w:t>
-      </w:r>
-      <w:proofErr w:type="gramEnd"/>
-      <w:r>
-        <w:rPr>
-          <w:rFonts w:eastAsiaTheme="minorEastAsia"/>
-          <w:color w:val="262626"/>
-          <w:lang w:val="en-GB" w:eastAsia="zh-CN"/>
-        </w:rPr>
-        <w:t>.(2022).PDCA</w:t>
-      </w:r>
-      <w:r>
-        <w:rPr>
-          <w:rFonts w:eastAsiaTheme="minorEastAsia" w:hint="eastAsia"/>
-          <w:color w:val="262626"/>
-          <w:lang w:val="en-GB" w:eastAsia="zh-CN"/>
-        </w:rPr>
-        <w:t>在儿科护理文书书写质量管理的应用</w:t>
-      </w:r>
-      <w:r>
-        <w:rPr>
-          <w:rFonts w:eastAsiaTheme="minorEastAsia"/>
-          <w:color w:val="262626"/>
-          <w:lang w:val="en-GB" w:eastAsia="zh-CN"/>
-        </w:rPr>
-        <w:t>.</w:t>
-      </w:r>
-      <w:r>
-        <w:rPr>
-          <w:rFonts w:eastAsiaTheme="minorEastAsia" w:hint="eastAsia"/>
-          <w:color w:val="262626"/>
-          <w:lang w:val="en-GB" w:eastAsia="zh-CN"/>
-        </w:rPr>
-        <w:t>中国病案</w:t>
-      </w:r>
-      <w:r>
-        <w:rPr>
-          <w:rFonts w:eastAsiaTheme="minorEastAsia"/>
-          <w:color w:val="262626"/>
-          <w:lang w:val="en-GB" w:eastAsia="zh-CN"/>
-        </w:rPr>
-        <w:t>,23 (8),8-10.</w:t>
-      </w:r>
-    </w:p>
-    <w:p>
-      <w:pPr>
-        <w:spacing w:line="276" w:lineRule="auto"/>
-        <w:ind w:leftChars="0" w:left="0" w:firstLineChars="0" w:firstLine="0"/>
-        <w:rPr>
-          <w:rFonts w:eastAsiaTheme="minorEastAsia" w:hint="eastAsia"/>
-          <w:color w:val="262626"/>
-          <w:lang w:val="en-GB" w:eastAsia="zh-CN"/>
-        </w:rPr>
-      </w:pPr>
-    </w:p>
-    <w:p>
-      <w:pPr>
-        <w:spacing w:line="276" w:lineRule="auto"/>
-        <w:ind w:left="0" w:hanging="2"/>
-        <w:rPr>
-          <w:color w:val="262626"/>
-          <w:lang w:val="en-GB"/>
-        </w:rPr>
-      </w:pPr>
-      <w:r>
-        <w:rPr>
-          <w:color w:val="262626"/>
-          <w:lang w:val="en-GB"/>
-        </w:rPr>
-        <w:t xml:space="preserve">Student's Signature: </w:t>
-      </w:r>
-      <w:r>
-        <w:rPr>
-          <w:color w:val="FF0000"/>
-          <w:lang w:val="en-GB"/>
-        </w:rPr>
-        <w:t>[Your signature]</w:t>
-      </w:r>
-    </w:p>
-    <w:p>
-      <w:pPr>
-        <w:spacing w:line="276" w:lineRule="auto"/>
-        <w:ind w:left="0" w:hanging="2"/>
-        <w:rPr>
-          <w:color w:val="262626"/>
-          <w:lang w:val="en-GB"/>
-        </w:rPr>
-      </w:pPr>
-      <w:proofErr w:type="spellStart"/>
-      <w:r>
-        <w:rPr>
-          <w:rFonts w:hint="eastAsia"/>
-          <w:color w:val="262626"/>
-          <w:lang w:val="en-GB"/>
-        </w:rPr>
-        <w:lastRenderedPageBreak/>
-        <w:t>学生签字</w:t>
-      </w:r>
-      <w:proofErr w:type="spellEnd"/>
-      <w:r>
-        <w:rPr>
-          <w:rFonts w:hint="eastAsia"/>
-          <w:color w:val="262626"/>
-          <w:lang w:val="en-GB"/>
-        </w:rPr>
-        <w:t>：【</w:t>
-      </w:r>
-      <w:proofErr w:type="spellStart"/>
-      <w:r>
-        <w:rPr>
-          <w:rFonts w:hint="eastAsia"/>
-          <w:color w:val="262626"/>
-          <w:lang w:val="en-GB"/>
-        </w:rPr>
-        <w:t>你的签字</w:t>
-      </w:r>
-      <w:proofErr w:type="spellEnd"/>
-      <w:r>
-        <w:rPr>
-          <w:rFonts w:hint="eastAsia"/>
-          <w:color w:val="262626"/>
-          <w:lang w:val="en-GB"/>
-        </w:rPr>
-        <w:t>】</w:t>
-      </w:r>
-    </w:p>
-    <w:p>
-      <w:pPr>
-        <w:spacing w:line="276" w:lineRule="auto"/>
-        <w:ind w:left="0" w:hanging="2"/>
-        <w:rPr>
-          <w:color w:val="262626"/>
-          <w:lang w:val="en-GB"/>
-        </w:rPr>
-      </w:pPr>
-      <w:r>
-        <w:rPr>
-          <w:color w:val="262626"/>
-          <w:lang w:val="en-GB"/>
-        </w:rPr>
-        <w:t>Approved by</w:t>
-      </w:r>
-      <w:r>
-        <w:rPr>
-          <w:lang w:val="en-GB"/>
-        </w:rPr>
-        <w:t>:</w:t>
-      </w:r>
-      <w:r>
-        <w:rPr>
-          <w:color w:val="FF0000"/>
-          <w:lang w:val="en-GB"/>
-        </w:rPr>
-        <w:t xml:space="preserve"> [The Thesis committee]</w:t>
-      </w:r>
-    </w:p>
-    <w:p>
-      <w:pPr>
-        <w:spacing w:line="276" w:lineRule="auto"/>
-        <w:ind w:left="0" w:hanging="2"/>
-        <w:rPr>
-          <w:color w:val="262626"/>
-          <w:lang w:val="en-GB"/>
-        </w:rPr>
-      </w:pPr>
-      <w:proofErr w:type="spellStart"/>
-      <w:r>
-        <w:rPr>
-          <w:rFonts w:hint="eastAsia"/>
-          <w:color w:val="262626"/>
-          <w:lang w:val="en-GB"/>
-        </w:rPr>
-        <w:t>审核通过</w:t>
-      </w:r>
-      <w:proofErr w:type="spellEnd"/>
-      <w:r>
-        <w:rPr>
-          <w:rFonts w:hint="eastAsia"/>
-          <w:color w:val="262626"/>
-          <w:lang w:val="en-GB"/>
-        </w:rPr>
-        <w:t>：【</w:t>
-      </w:r>
-      <w:proofErr w:type="spellStart"/>
-      <w:r>
-        <w:rPr>
-          <w:rFonts w:hint="eastAsia"/>
-          <w:color w:val="262626"/>
-          <w:lang w:val="en-GB"/>
-        </w:rPr>
-        <w:t>论文委员会</w:t>
-      </w:r>
-      <w:proofErr w:type="spellEnd"/>
-      <w:r>
-        <w:rPr>
-          <w:rFonts w:hint="eastAsia"/>
-          <w:color w:val="262626"/>
-          <w:lang w:val="en-GB"/>
-        </w:rPr>
-        <w:t>】</w:t>
-      </w:r>
-    </w:p>
-    <w:p>
-      <w:pPr>
-        <w:spacing w:line="276" w:lineRule="auto"/>
-        <w:ind w:left="0" w:hanging="2"/>
-        <w:rPr>
-          <w:color w:val="262626"/>
-          <w:lang w:val="en-GB"/>
-        </w:rPr>
-      </w:pPr>
-    </w:p>
-    <w:p>
-      <w:pPr>
-        <w:spacing w:line="276" w:lineRule="auto"/>
-        <w:ind w:left="0" w:hanging="2"/>
-        <w:rPr>
-          <w:color w:val="262626"/>
           <w:lang w:val="en-GB"/>
         </w:rPr>
       </w:pPr>
     </w:p>
     <w:sectPr>
-      <w:headerReference w:type="even" r:id="rId13"/>
-      <w:headerReference w:type="default" r:id="rId14"/>
-      <w:footerReference w:type="even" r:id="rId15"/>
-      <w:footerReference w:type="default" r:id="rId16"/>
-      <w:headerReference w:type="first" r:id="rId17"/>
-      <w:footerReference w:type="first" r:id="rId18"/>
+      <w:headerReference w:type="even" r:id="rId14"/>
+      <w:headerReference w:type="default" r:id="rId15"/>
+      <w:footerReference w:type="even" r:id="rId16"/>
+      <w:footerReference w:type="default" r:id="rId17"/>
+      <w:headerReference w:type="first" r:id="rId18"/>
+      <w:footerReference w:type="first" r:id="rId19"/>
       <w:pgSz w:w="11906" w:h="16838"/>
       <w:pgMar w:top="1417" w:right="1417" w:bottom="1080" w:left="1417" w:header="708" w:footer="708" w:gutter="0"/>
       <w:pgNumType w:start="1"/>
@@ -2780,7 +4810,7 @@
         </w:numPr>
         <w:ind w:left="0" w:hanging="2"/>
         <w:rPr>
-          <w:rFonts w:ascii="宋体" w:eastAsia="宋体" w:hAnsi="宋体" w:cs="宋体"/>
+          <w:rFonts w:ascii="宋体" w:eastAsia="宋体" w:hAnsi="宋体" w:cs="宋体" w:hint="eastAsia"/>
           <w:lang w:val="en-US" w:eastAsia="zh-CN"/>
         </w:rPr>
       </w:pPr>
@@ -2852,7 +4882,7 @@
         <w:pStyle w:val="ae"/>
         <w:ind w:leftChars="0" w:left="0" w:firstLineChars="0" w:firstLine="0"/>
         <w:rPr>
-          <w:rFonts w:ascii="宋体" w:eastAsia="宋体" w:hAnsi="宋体" w:cs="宋体"/>
+          <w:rFonts w:ascii="宋体" w:eastAsia="宋体" w:hAnsi="宋体" w:cs="宋体" w:hint="eastAsia"/>
           <w:lang w:val="en-US" w:eastAsia="zh-CN"/>
         </w:rPr>
       </w:pPr>

</xml_diff>